<commit_message>
aps to mini cv
</commit_message>
<xml_diff>
--- a/downloads/cvs/DOCX/Arron Ware CV MASTER CV EVERYTHING ADD TO THIS NOT FINISHED.docx
+++ b/downloads/cvs/DOCX/Arron Ware CV MASTER CV EVERYTHING ADD TO THIS NOT FINISHED.docx
@@ -2,11 +2,11 @@
 <file path=word/document.xml><?xml version="1.0" encoding="utf-8"?>
 <w:document xmlns:o="urn:schemas-microsoft-com:office:office" xmlns:r="http://schemas.openxmlformats.org/officeDocument/2006/relationships" xmlns:v="urn:schemas-microsoft-com:vml" xmlns:w="http://schemas.openxmlformats.org/wordprocessingml/2006/main" xmlns:w10="urn:schemas-microsoft-com:office:word" xmlns:wp="http://schemas.openxmlformats.org/drawingml/2006/wordprocessingDrawing" xmlns:wps="http://schemas.microsoft.com/office/word/2010/wordprocessingShape" xmlns:wpg="http://schemas.microsoft.com/office/word/2010/wordprocessingGroup" xmlns:mc="http://schemas.openxmlformats.org/markup-compatibility/2006" xmlns:wp14="http://schemas.microsoft.com/office/word/2010/wordprocessingDrawing" xmlns:w14="http://schemas.microsoft.com/office/word/2010/wordml" xmlns:w15="http://schemas.microsoft.com/office/word/2012/wordml" mc:Ignorable="w14 wp14 w15">
   <w:body>
-    <w:p xmlns:wp14="http://schemas.microsoft.com/office/word/2010/wordml" wp14:textId="77777777">
-      <w:pPr>
-        <w:pStyle w:val="Normal"/>
-        <w:spacing w:before="0" w:after="0" w:line="259" w:lineRule="auto"/>
-        <w:ind w:left="16" w:right="0" w:hanging="0"/>
+    <w:p>
+      <w:pPr>
+        <w:pStyle w:val="Normal"/>
+        <w:spacing w:lineRule="auto" w:line="259" w:before="0" w:after="0"/>
+        <w:ind w:hanging="0" w:left="16" w:right="0"/>
         <w:jc w:val="center"/>
         <w:rPr/>
       </w:pPr>
@@ -18,11 +18,11 @@
         <w:t>ARRON WARE</w:t>
       </w:r>
     </w:p>
-    <w:p xmlns:wp14="http://schemas.microsoft.com/office/word/2010/wordml" wp14:textId="77777777">
-      <w:pPr>
-        <w:pStyle w:val="Normal"/>
-        <w:spacing w:before="0" w:after="0" w:afterAutospacing="0" w:line="240" w:lineRule="auto"/>
-        <w:ind w:left="2880" w:right="2862" w:hanging="0"/>
+    <w:p>
+      <w:pPr>
+        <w:pStyle w:val="Normal"/>
+        <w:spacing w:lineRule="auto" w:line="240" w:before="0" w:afterAutospacing="0" w:after="0"/>
+        <w:ind w:hanging="0" w:left="2880" w:right="2862"/>
         <w:jc w:val="center"/>
         <w:rPr/>
       </w:pPr>
@@ -39,11 +39,11 @@
         </w:r>
       </w:hyperlink>
     </w:p>
-    <w:p xmlns:wp14="http://schemas.microsoft.com/office/word/2010/wordml" wp14:textId="77777777">
-      <w:pPr>
-        <w:pStyle w:val="Normal"/>
-        <w:spacing w:before="0" w:after="958" w:line="240" w:lineRule="auto"/>
-        <w:ind w:left="2880" w:right="2862" w:hanging="0"/>
+    <w:p>
+      <w:pPr>
+        <w:pStyle w:val="Normal"/>
+        <w:spacing w:lineRule="auto" w:line="240" w:before="0" w:after="958"/>
+        <w:ind w:hanging="0" w:left="2880" w:right="2862"/>
         <w:jc w:val="center"/>
         <w:rPr/>
       </w:pPr>
@@ -56,11 +56,11 @@
         </w:r>
       </w:hyperlink>
     </w:p>
-    <w:p xmlns:wp14="http://schemas.microsoft.com/office/word/2010/wordml" wp14:textId="77777777">
+    <w:p>
       <w:pPr>
         <w:pStyle w:val="Heading1"/>
         <w:spacing w:before="0" w:after="212"/>
-        <w:ind w:left="-5" w:hanging="10"/>
+        <w:ind w:hanging="10" w:left="-5"/>
         <w:rPr/>
       </w:pPr>
       <w:r>
@@ -68,23 +68,23 @@
         <w:t>PERSONAL STATEMENT</w:t>
       </w:r>
     </w:p>
-    <w:p xmlns:wp14="http://schemas.microsoft.com/office/word/2010/wordml" wp14:textId="1020ADF2">
+    <w:p>
       <w:pPr>
         <w:pStyle w:val="Heading1"/>
         <w:spacing w:before="0" w:after="212"/>
-        <w:ind w:left="-5" w:hanging="10"/>
-        <w:rPr>
-          <w:b w:val="0"/>
-          <w:bCs w:val="0"/>
-          <w:sz w:val="24"/>
-          <w:szCs w:val="24"/>
-        </w:rPr>
-      </w:pPr>
-      <w:bookmarkStart w:name="_Hlk204965623" w:id="0"/>
-      <w:r>
-        <w:rPr>
-          <w:b w:val="0"/>
-          <w:bCs w:val="0"/>
+        <w:ind w:hanging="10" w:left="-5"/>
+        <w:rPr>
+          <w:b w:val="false"/>
+          <w:bCs w:val="false"/>
+          <w:sz w:val="24"/>
+          <w:szCs w:val="24"/>
+        </w:rPr>
+      </w:pPr>
+      <w:bookmarkStart w:id="0" w:name="_Hlk204965623"/>
+      <w:r>
+        <w:rPr>
+          <w:b w:val="false"/>
+          <w:bCs w:val="false"/>
           <w:sz w:val="24"/>
           <w:szCs w:val="24"/>
         </w:rPr>
@@ -93,87 +93,24 @@
       <w:bookmarkEnd w:id="0"/>
       <w:r>
         <w:rPr>
-          <w:b w:val="0"/>
-          <w:bCs w:val="0"/>
-          <w:sz w:val="24"/>
-          <w:szCs w:val="24"/>
-        </w:rPr>
-        <w:t xml:space="preserve">keen to apply my skillset within the media sector. I have an extensive </w:t>
-      </w:r>
-      <w:r>
-        <w:rPr>
-          <w:b w:val="0"/>
-          <w:bCs w:val="0"/>
-          <w:sz w:val="24"/>
-          <w:szCs w:val="24"/>
-        </w:rPr>
-        <w:t>experience with</w:t>
-      </w:r>
-      <w:r>
-        <w:rPr>
-          <w:b w:val="0"/>
-          <w:bCs w:val="0"/>
-          <w:sz w:val="24"/>
-          <w:szCs w:val="24"/>
-        </w:rPr>
-        <w:t xml:space="preserve"> production hardware and software from my time studying Music &amp; Sound </w:t>
-      </w:r>
-      <w:r>
-        <w:rPr>
-          <w:b w:val="0"/>
-          <w:bCs w:val="0"/>
-          <w:sz w:val="24"/>
-          <w:szCs w:val="24"/>
-        </w:rPr>
-        <w:t>Design at University.</w:t>
-      </w:r>
-      <w:r>
-        <w:rPr>
-          <w:b w:val="0"/>
-          <w:bCs w:val="0"/>
-          <w:sz w:val="24"/>
-          <w:szCs w:val="24"/>
-        </w:rPr>
-        <w:t xml:space="preserve"> </w:t>
-      </w:r>
-      <w:r>
-        <w:rPr>
-          <w:b w:val="0"/>
-          <w:bCs w:val="0"/>
-          <w:sz w:val="24"/>
-          <w:szCs w:val="24"/>
-        </w:rPr>
-        <w:t xml:space="preserve">I have completed work experience with dock10’s MCR Engineering team, </w:t>
-      </w:r>
-      <w:r>
-        <w:rPr>
-          <w:b w:val="0"/>
-          <w:bCs w:val="0"/>
-          <w:sz w:val="24"/>
-          <w:szCs w:val="24"/>
-        </w:rPr>
-        <w:t xml:space="preserve">where </w:t>
-      </w:r>
-      <w:r>
-        <w:rPr>
-          <w:b w:val="0"/>
-          <w:bCs w:val="0"/>
-          <w:sz w:val="24"/>
-          <w:szCs w:val="24"/>
-        </w:rPr>
-        <w:t xml:space="preserve">I enjoyed utilising my technical knowledge to aid productions whilst communicating with a variety of people. </w:t>
-      </w:r>
-    </w:p>
-    <w:p xmlns:wp14="http://schemas.microsoft.com/office/word/2010/wordml" wp14:textId="77777777">
-      <w:pPr>
-        <w:pStyle w:val="Normal"/>
-        <w:rPr/>
-      </w:pPr>
-      <w:r>
-        <w:rPr/>
-      </w:r>
-    </w:p>
-    <w:p xmlns:wp14="http://schemas.microsoft.com/office/word/2010/wordml" wp14:textId="77777777">
+          <w:b w:val="false"/>
+          <w:bCs w:val="false"/>
+          <w:sz w:val="24"/>
+          <w:szCs w:val="24"/>
+        </w:rPr>
+        <w:t xml:space="preserve">keen to apply my skillset within the media sector. I have an extensive experience with production hardware and software from my time studying Music &amp; Sound Design at University. I have completed work experience with dock10’s MCR Engineering team, where I enjoyed utilising my technical knowledge to aid productions whilst communicating with a variety of people. </w:t>
+      </w:r>
+    </w:p>
+    <w:p>
+      <w:pPr>
+        <w:pStyle w:val="Normal"/>
+        <w:rPr/>
+      </w:pPr>
+      <w:r>
+        <w:rPr/>
+      </w:r>
+    </w:p>
+    <w:p>
       <w:pPr>
         <w:pStyle w:val="Normal"/>
         <w:spacing w:before="0" w:after="0"/>
@@ -183,11 +120,11 @@
         <w:rPr/>
       </w:r>
     </w:p>
-    <w:p xmlns:wp14="http://schemas.microsoft.com/office/word/2010/wordml" wp14:textId="77777777">
+    <w:p>
       <w:pPr>
         <w:pStyle w:val="Heading1"/>
         <w:spacing w:before="0" w:after="212"/>
-        <w:ind w:left="-5" w:hanging="10"/>
+        <w:ind w:hanging="10" w:left="-5"/>
         <w:rPr/>
       </w:pPr>
       <w:r>
@@ -195,23 +132,20 @@
         <w:t xml:space="preserve">EDUCATION </w:t>
       </w:r>
     </w:p>
-    <w:p xmlns:wp14="http://schemas.microsoft.com/office/word/2010/wordml" wp14:textId="77777777">
+    <w:p>
       <w:pPr>
         <w:pStyle w:val="Normal"/>
         <w:tabs>
           <w:tab w:val="clear" w:pos="720"/>
-          <w:tab w:val="center" w:leader="none" w:pos="4192"/>
-        </w:tabs>
-        <w:spacing w:before="0" w:after="0" w:line="259" w:lineRule="auto"/>
-        <w:ind w:left="-15" w:right="0" w:hanging="0"/>
+          <w:tab w:val="center" w:pos="4192" w:leader="none"/>
+        </w:tabs>
+        <w:spacing w:lineRule="auto" w:line="259" w:before="0" w:after="0"/>
+        <w:ind w:hanging="0" w:left="-15" w:right="0"/>
         <w:rPr/>
       </w:pPr>
       <w:r>
         <w:rPr/>
         <w:t>2022-2025</w:t>
-      </w:r>
-      <w:r>
-        <w:rPr/>
         <w:tab/>
       </w:r>
       <w:r>
@@ -221,54 +155,33 @@
         <w:t>Manchester Metropolitan University</w:t>
       </w:r>
     </w:p>
-    <w:p xmlns:wp14="http://schemas.microsoft.com/office/word/2010/wordml" wp14:textId="30AB804F">
-      <w:pPr>
-        <w:pStyle w:val="Normal"/>
-        <w:spacing w:before="0" w:after="142" w:line="259" w:lineRule="auto"/>
-        <w:ind w:left="2170" w:right="0" w:hanging="10"/>
-        <w:rPr>
-          <w:b w:val="1"/>
-          <w:bCs w:val="1"/>
-        </w:rPr>
-      </w:pPr>
-      <w:r>
-        <w:rPr>
-          <w:b w:val="1"/>
-          <w:bCs w:val="1"/>
-        </w:rPr>
-        <w:t xml:space="preserve">Undergraduate </w:t>
-      </w:r>
-      <w:r>
-        <w:rPr>
-          <w:b w:val="1"/>
-          <w:bCs w:val="1"/>
-        </w:rPr>
-        <w:t>Music and Sound</w:t>
-      </w:r>
-      <w:r>
-        <w:rPr>
-          <w:b w:val="1"/>
-          <w:bCs w:val="1"/>
-        </w:rPr>
-        <w:t xml:space="preserve"> </w:t>
-      </w:r>
-      <w:r>
-        <w:rPr>
-          <w:b w:val="1"/>
-          <w:bCs w:val="1"/>
-        </w:rPr>
-        <w:t>Design (2:1)</w:t>
-      </w:r>
-    </w:p>
-    <w:p xmlns:wp14="http://schemas.microsoft.com/office/word/2010/wordml" wp14:textId="77777777">
+    <w:p>
+      <w:pPr>
+        <w:pStyle w:val="Normal"/>
+        <w:spacing w:lineRule="auto" w:line="259" w:before="0" w:after="142"/>
+        <w:ind w:hanging="10" w:left="2170" w:right="0"/>
+        <w:rPr>
+          <w:b/>
+          <w:bCs/>
+        </w:rPr>
+      </w:pPr>
+      <w:r>
+        <w:rPr>
+          <w:b/>
+          <w:bCs/>
+        </w:rPr>
+        <w:t>Undergraduate Music and Sound Design (2:1)</w:t>
+      </w:r>
+    </w:p>
+    <w:p>
       <w:pPr>
         <w:pStyle w:val="Normal"/>
         <w:numPr>
           <w:ilvl w:val="0"/>
           <w:numId w:val="6"/>
         </w:numPr>
-        <w:spacing w:before="0" w:after="0" w:line="276" w:lineRule="auto"/>
-        <w:ind w:left="720" w:right="0" w:hanging="360"/>
+        <w:spacing w:lineRule="auto" w:line="276" w:before="0" w:after="0"/>
+        <w:ind w:hanging="360" w:left="720" w:right="0"/>
         <w:rPr>
           <w:rFonts w:eastAsia="Times New Roman"/>
           <w:color w:val="auto"/>
@@ -286,7 +199,7 @@
         <w:t>AV post-production, mixing and mastering in DAWs and FMOD.</w:t>
       </w:r>
     </w:p>
-    <w:p xmlns:wp14="http://schemas.microsoft.com/office/word/2010/wordml" wp14:textId="77777777">
+    <w:p>
       <w:pPr>
         <w:pStyle w:val="Normal"/>
         <w:numPr>
@@ -295,8 +208,8 @@
         </w:numPr>
         <w:suppressLineNumbers w:val="0"/>
         <w:bidi w:val="0"/>
-        <w:spacing w:before="0" w:beforeAutospacing="0" w:after="0" w:afterAutospacing="0" w:line="240" w:lineRule="auto"/>
-        <w:ind w:left="720" w:right="0" w:hanging="360"/>
+        <w:spacing w:lineRule="auto" w:line="240" w:beforeAutospacing="0" w:before="0" w:afterAutospacing="0" w:after="0"/>
+        <w:ind w:hanging="360" w:left="720" w:right="0"/>
         <w:jc w:val="left"/>
         <w:rPr>
           <w:rFonts w:eastAsia="Times New Roman"/>
@@ -311,15 +224,15 @@
         <w:t>Using and helping others configure the studios’ Dante IP transmission system to route signals to and from control rooms.</w:t>
       </w:r>
     </w:p>
-    <w:p xmlns:wp14="http://schemas.microsoft.com/office/word/2010/wordml" wp14:textId="72674206">
+    <w:p>
       <w:pPr>
         <w:pStyle w:val="Normal"/>
         <w:numPr>
           <w:ilvl w:val="0"/>
           <w:numId w:val="6"/>
         </w:numPr>
-        <w:spacing w:before="0" w:after="0" w:line="276" w:lineRule="auto"/>
-        <w:ind w:left="720" w:right="0" w:hanging="360"/>
+        <w:spacing w:lineRule="auto" w:line="276" w:before="0" w:after="0"/>
+        <w:ind w:hanging="360" w:left="720" w:right="0"/>
         <w:rPr>
           <w:rFonts w:eastAsia="Times New Roman"/>
           <w:color w:val="auto"/>
@@ -346,28 +259,7 @@
           <w:rFonts w:eastAsia="Times New Roman"/>
           <w:color w:val="auto"/>
         </w:rPr>
-        <w:t xml:space="preserve">in </w:t>
-      </w:r>
-      <w:r>
-        <w:rPr>
-          <w:rFonts w:eastAsia="Times New Roman"/>
-          <w:color w:val="auto"/>
-        </w:rPr>
-        <w:t xml:space="preserve">Dante-centric </w:t>
-      </w:r>
-      <w:r>
-        <w:rPr>
-          <w:rFonts w:eastAsia="Times New Roman"/>
-          <w:color w:val="auto"/>
-        </w:rPr>
-        <w:t>studio</w:t>
-      </w:r>
-      <w:r>
-        <w:rPr>
-          <w:rFonts w:eastAsia="Times New Roman"/>
-          <w:color w:val="auto"/>
-        </w:rPr>
-        <w:t>s to route signals</w:t>
+        <w:t>in Dante-centric studios to route signals</w:t>
       </w:r>
       <w:r>
         <w:rPr>
@@ -383,25 +275,18 @@
           <w:rFonts w:eastAsia="Times New Roman"/>
           <w:color w:val="auto"/>
         </w:rPr>
-        <w:t>and apply effects</w:t>
-      </w:r>
-      <w:r>
-        <w:rPr>
-          <w:rFonts w:eastAsia="Times New Roman"/>
-          <w:color w:val="auto"/>
-        </w:rPr>
-        <w:t>.</w:t>
-      </w:r>
-    </w:p>
-    <w:p xmlns:wp14="http://schemas.microsoft.com/office/word/2010/wordml" wp14:textId="77777777">
+        <w:t>and apply effects.</w:t>
+      </w:r>
+    </w:p>
+    <w:p>
       <w:pPr>
         <w:pStyle w:val="Normal"/>
         <w:numPr>
           <w:ilvl w:val="0"/>
           <w:numId w:val="6"/>
         </w:numPr>
-        <w:spacing w:before="0" w:after="0" w:line="240" w:lineRule="auto"/>
-        <w:ind w:left="720" w:right="0" w:hanging="360"/>
+        <w:spacing w:lineRule="auto" w:line="240" w:before="0" w:after="0"/>
+        <w:ind w:hanging="360" w:left="720" w:right="0"/>
         <w:rPr>
           <w:rFonts w:eastAsia="Times New Roman"/>
           <w:color w:val="auto"/>
@@ -415,33 +300,30 @@
         <w:t>Troubleshooted complex studio configurations digitally within the mixing desk (SSL System T S300) and physically within the studios.</w:t>
       </w:r>
     </w:p>
-    <w:p xmlns:wp14="http://schemas.microsoft.com/office/word/2010/wordml" wp14:textId="77777777">
-      <w:pPr>
-        <w:pStyle w:val="Normal"/>
-        <w:ind w:left="3250" w:right="0" w:hanging="370"/>
-        <w:rPr/>
-      </w:pPr>
-      <w:r>
-        <w:rPr/>
-      </w:r>
-    </w:p>
-    <w:p xmlns:wp14="http://schemas.microsoft.com/office/word/2010/wordml" wp14:textId="77777777">
+    <w:p>
+      <w:pPr>
+        <w:pStyle w:val="Normal"/>
+        <w:ind w:hanging="370" w:left="3250" w:right="0"/>
+        <w:rPr/>
+      </w:pPr>
+      <w:r>
+        <w:rPr/>
+      </w:r>
+    </w:p>
+    <w:p>
       <w:pPr>
         <w:pStyle w:val="Normal"/>
         <w:tabs>
           <w:tab w:val="clear" w:pos="720"/>
-          <w:tab w:val="center" w:leader="none" w:pos="3612"/>
-        </w:tabs>
-        <w:spacing w:before="0" w:after="142" w:line="259" w:lineRule="auto"/>
-        <w:ind w:left="-15" w:right="0" w:hanging="0"/>
+          <w:tab w:val="center" w:pos="3612" w:leader="none"/>
+        </w:tabs>
+        <w:spacing w:lineRule="auto" w:line="259" w:before="0" w:after="142"/>
+        <w:ind w:hanging="0" w:left="-15" w:right="0"/>
         <w:rPr/>
       </w:pPr>
       <w:r>
         <w:rPr/>
         <w:t>2019-2022</w:t>
-      </w:r>
-      <w:r>
-        <w:rPr/>
         <w:tab/>
       </w:r>
       <w:r>
@@ -451,14 +333,14 @@
         <w:t>Grimsby Institute College</w:t>
       </w:r>
     </w:p>
-    <w:p xmlns:wp14="http://schemas.microsoft.com/office/word/2010/wordml" wp14:textId="77777777">
+    <w:p>
       <w:pPr>
         <w:pStyle w:val="Normal"/>
         <w:numPr>
           <w:ilvl w:val="0"/>
           <w:numId w:val="2"/>
         </w:numPr>
-        <w:ind w:left="705" w:right="0" w:hanging="360"/>
+        <w:ind w:hanging="360" w:left="705" w:right="0"/>
         <w:rPr>
           <w:b/>
           <w:bCs/>
@@ -472,15 +354,15 @@
         <w:t>BTEC: Level 1/2 Information and Creative Technology (Double Distinction*)</w:t>
       </w:r>
     </w:p>
-    <w:p xmlns:wp14="http://schemas.microsoft.com/office/word/2010/wordml" wp14:textId="77777777">
+    <w:p>
       <w:pPr>
         <w:pStyle w:val="Normal"/>
         <w:numPr>
           <w:ilvl w:val="0"/>
           <w:numId w:val="2"/>
         </w:numPr>
-        <w:spacing w:before="0" w:after="5" w:afterAutospacing="0"/>
-        <w:ind w:left="705" w:right="0" w:hanging="360"/>
+        <w:spacing w:before="0" w:afterAutospacing="0" w:after="5"/>
+        <w:ind w:hanging="360" w:left="705" w:right="0"/>
         <w:rPr>
           <w:b/>
           <w:bCs/>
@@ -494,64 +376,29 @@
         <w:t>T Level: Digital Production, Design and Development (Merit):</w:t>
       </w:r>
     </w:p>
-    <w:p xmlns:wp14="http://schemas.microsoft.com/office/word/2010/wordml" wp14:textId="178E37C9">
-      <w:pPr>
-        <w:pStyle w:val="Normal"/>
-        <w:spacing w:before="0" w:after="0" w:afterAutospacing="off"/>
-        <w:ind w:left="705" w:right="0" w:hanging="360"/>
-        <w:rPr>
-          <w:b w:val="0"/>
-          <w:bCs w:val="0"/>
-        </w:rPr>
-      </w:pPr>
-      <w:r>
-        <w:rPr>
-          <w:b w:val="0"/>
-          <w:bCs w:val="0"/>
-        </w:rPr>
-        <w:t>- Programming in Python</w:t>
-      </w:r>
-      <w:r>
-        <w:rPr>
-          <w:b w:val="0"/>
-          <w:bCs w:val="0"/>
-        </w:rPr>
-        <w:t xml:space="preserve">, PHP, </w:t>
-      </w:r>
-      <w:r>
-        <w:rPr>
-          <w:b w:val="0"/>
-          <w:bCs w:val="0"/>
-        </w:rPr>
-        <w:t>SQL</w:t>
-      </w:r>
-      <w:r>
-        <w:rPr>
-          <w:b w:val="0"/>
-          <w:bCs w:val="0"/>
-        </w:rPr>
-        <w:t xml:space="preserve"> and </w:t>
-      </w:r>
-      <w:r>
-        <w:rPr>
-          <w:b w:val="0"/>
-          <w:bCs w:val="0"/>
-        </w:rPr>
-        <w:t>HTML</w:t>
-      </w:r>
-      <w:r>
-        <w:rPr>
-          <w:b w:val="0"/>
-          <w:bCs w:val="0"/>
-        </w:rPr>
-        <w:t>.</w:t>
-      </w:r>
-    </w:p>
-    <w:p xmlns:wp14="http://schemas.microsoft.com/office/word/2010/wordml" wp14:textId="77777777">
-      <w:pPr>
-        <w:pStyle w:val="Normal"/>
-        <w:spacing w:before="0" w:after="0" w:afterAutospacing="0"/>
-        <w:ind w:left="705" w:right="0" w:hanging="360"/>
+    <w:p>
+      <w:pPr>
+        <w:pStyle w:val="Normal"/>
+        <w:spacing w:before="0" w:afterAutospacing="0" w:after="0"/>
+        <w:ind w:hanging="360" w:left="705" w:right="0"/>
+        <w:rPr>
+          <w:b w:val="false"/>
+          <w:bCs w:val="false"/>
+        </w:rPr>
+      </w:pPr>
+      <w:r>
+        <w:rPr>
+          <w:b w:val="false"/>
+          <w:bCs w:val="false"/>
+        </w:rPr>
+        <w:t>- Programming in Python, PHP, SQL and HTML.</w:t>
+      </w:r>
+    </w:p>
+    <w:p>
+      <w:pPr>
+        <w:pStyle w:val="Normal"/>
+        <w:spacing w:before="0" w:afterAutospacing="0" w:after="0"/>
+        <w:ind w:hanging="360" w:left="705" w:right="0"/>
         <w:rPr>
           <w:b w:val="false"/>
           <w:bCs w:val="false"/>
@@ -565,11 +412,11 @@
         <w:t>- Network structure, security and infrastructure.</w:t>
       </w:r>
     </w:p>
-    <w:p xmlns:wp14="http://schemas.microsoft.com/office/word/2010/wordml" wp14:textId="77777777">
+    <w:p>
       <w:pPr>
         <w:pStyle w:val="Normal"/>
         <w:spacing w:before="0" w:after="254"/>
-        <w:ind w:left="345" w:right="0" w:hanging="0"/>
+        <w:ind w:hanging="0" w:left="345" w:right="0"/>
         <w:rPr>
           <w:b/>
           <w:bCs/>
@@ -582,23 +429,20 @@
         </w:rPr>
       </w:r>
     </w:p>
-    <w:p xmlns:wp14="http://schemas.microsoft.com/office/word/2010/wordml" wp14:textId="77777777">
+    <w:p>
       <w:pPr>
         <w:pStyle w:val="Normal"/>
         <w:tabs>
           <w:tab w:val="clear" w:pos="720"/>
-          <w:tab w:val="center" w:leader="none" w:pos="5092"/>
-        </w:tabs>
-        <w:spacing w:before="0" w:after="142" w:line="259" w:lineRule="auto"/>
-        <w:ind w:left="-15" w:right="0" w:hanging="0"/>
+          <w:tab w:val="center" w:pos="5092" w:leader="none"/>
+        </w:tabs>
+        <w:spacing w:lineRule="auto" w:line="259" w:before="0" w:after="142"/>
+        <w:ind w:hanging="0" w:left="-15" w:right="0"/>
         <w:rPr/>
       </w:pPr>
       <w:r>
         <w:rPr/>
         <w:t>2014-2019</w:t>
-      </w:r>
-      <w:r>
-        <w:rPr/>
         <w:tab/>
       </w:r>
       <w:r>
@@ -608,14 +452,14 @@
         <w:t>Oasis Academy Immingham/The Academy Grimsby</w:t>
       </w:r>
     </w:p>
-    <w:p xmlns:wp14="http://schemas.microsoft.com/office/word/2010/wordml" wp14:textId="17D8E90C">
+    <w:p>
       <w:pPr>
         <w:pStyle w:val="Normal"/>
         <w:numPr>
           <w:ilvl w:val="0"/>
           <w:numId w:val="2"/>
         </w:numPr>
-        <w:ind w:left="705" w:right="0" w:hanging="360"/>
+        <w:ind w:hanging="360" w:left="705" w:right="0"/>
         <w:rPr/>
       </w:pPr>
       <w:r>
@@ -623,7 +467,7 @@
         <w:t>GCSEs</w:t>
       </w:r>
     </w:p>
-    <w:p xmlns:wp14="http://schemas.microsoft.com/office/word/2010/wordml" wp14:textId="77777777">
+    <w:p>
       <w:pPr>
         <w:pStyle w:val="Normal"/>
         <w:numPr>
@@ -631,7 +475,7 @@
           <w:numId w:val="2"/>
         </w:numPr>
         <w:spacing w:before="0" w:after="479"/>
-        <w:ind w:left="705" w:right="0" w:hanging="370"/>
+        <w:ind w:hanging="370" w:left="705" w:right="0"/>
         <w:rPr/>
       </w:pPr>
       <w:r>
@@ -639,10 +483,10 @@
         <w:t>BTEC: First Award in Creative Digital Media (Merit)</w:t>
       </w:r>
     </w:p>
-    <w:p xmlns:wp14="http://schemas.microsoft.com/office/word/2010/wordml" wp14:textId="77777777">
+    <w:p>
       <w:pPr>
         <w:pStyle w:val="Heading1"/>
-        <w:ind w:left="-5" w:hanging="10"/>
+        <w:ind w:hanging="10" w:left="-5"/>
         <w:rPr/>
       </w:pPr>
       <w:r>
@@ -650,11 +494,11 @@
         <w:t>CERTIFICATES</w:t>
       </w:r>
     </w:p>
-    <w:p xmlns:wp14="http://schemas.microsoft.com/office/word/2010/wordml" wp14:textId="77777777">
-      <w:pPr>
-        <w:pStyle w:val="Normal"/>
-        <w:spacing w:before="0" w:after="142" w:line="259" w:lineRule="auto"/>
-        <w:ind w:left="-5" w:right="0" w:hanging="10"/>
+    <w:p>
+      <w:pPr>
+        <w:pStyle w:val="Normal"/>
+        <w:spacing w:lineRule="auto" w:line="259" w:before="0" w:after="142"/>
+        <w:ind w:hanging="10" w:left="-5" w:right="0"/>
         <w:rPr/>
       </w:pPr>
       <w:r>
@@ -684,7 +528,7 @@
         <w:t xml:space="preserve"> Edition)</w:t>
       </w:r>
     </w:p>
-    <w:p xmlns:wp14="http://schemas.microsoft.com/office/word/2010/wordml" wp14:textId="77777777">
+    <w:p>
       <w:pPr>
         <w:pStyle w:val="Normal"/>
         <w:numPr>
@@ -692,7 +536,7 @@
           <w:numId w:val="3"/>
         </w:numPr>
         <w:spacing w:before="0" w:after="266"/>
-        <w:ind w:left="705" w:right="0" w:hanging="360"/>
+        <w:ind w:hanging="360" w:left="705" w:right="0"/>
         <w:rPr/>
       </w:pPr>
       <w:r>
@@ -700,11 +544,11 @@
         <w:t>This course developed my knowledge of TCP/IP networking, alongside how Dante systems interact with this protocol. This aids me in designing, maintaining, and interacting with these systems to ensure that they are configured in an efficient way.</w:t>
       </w:r>
     </w:p>
-    <w:p xmlns:wp14="http://schemas.microsoft.com/office/word/2010/wordml" wp14:textId="77777777">
-      <w:pPr>
-        <w:pStyle w:val="Normal"/>
-        <w:spacing w:before="0" w:after="0" w:line="240" w:lineRule="auto"/>
-        <w:ind w:left="705" w:right="0" w:hanging="370"/>
+    <w:p>
+      <w:pPr>
+        <w:pStyle w:val="Normal"/>
+        <w:spacing w:lineRule="auto" w:line="240" w:before="0" w:after="0"/>
+        <w:ind w:hanging="370" w:left="705" w:right="0"/>
         <w:rPr>
           <w:rFonts w:eastAsia="Times New Roman"/>
           <w:color w:val="auto"/>
@@ -721,11 +565,11 @@
         </w:rPr>
       </w:r>
     </w:p>
-    <w:p xmlns:wp14="http://schemas.microsoft.com/office/word/2010/wordml" wp14:textId="77777777">
+    <w:p>
       <w:pPr>
         <w:pStyle w:val="Heading1"/>
         <w:spacing w:before="0" w:after="176"/>
-        <w:ind w:left="-5" w:hanging="10"/>
+        <w:ind w:hanging="10" w:left="-5"/>
         <w:rPr/>
       </w:pPr>
       <w:r>
@@ -733,11 +577,12 @@
         <w:t>RELEVANT EXPERIENCE</w:t>
       </w:r>
     </w:p>
-    <w:p xmlns:wp14="http://schemas.microsoft.com/office/word/2010/wordml" wp14:textId="39AD693F">
-      <w:pPr>
-        <w:pStyle w:val="Normal"/>
-        <w:spacing w:before="0" w:after="142" w:line="259" w:lineRule="auto"/>
-        <w:ind w:left="-5" w:right="0" w:hanging="10"/>
+    <w:p>
+      <w:pPr>
+        <w:pStyle w:val="Normal"/>
+        <w:spacing w:lineRule="auto" w:line="259" w:before="0" w:after="142"/>
+        <w:ind w:hanging="10" w:left="-5" w:right="0"/>
+        <w:rPr/>
       </w:pPr>
       <w:r>
         <w:rPr/>
@@ -745,8 +590,8 @@
       </w:r>
       <w:r>
         <w:rPr>
-          <w:b w:val="1"/>
-          <w:bCs w:val="1"/>
+          <w:b/>
+          <w:bCs/>
         </w:rPr>
         <w:t xml:space="preserve"> Freelance (Sound Design, Photography)</w:t>
       </w:r>
@@ -759,30 +604,26 @@
           <w:numId w:val="3"/>
         </w:numPr>
         <w:spacing w:before="0" w:after="266"/>
-        <w:ind w:left="705" w:right="0" w:hanging="360"/>
-        <w:rPr/>
-      </w:pPr>
-      <w:r>
-        <w:rPr/>
-        <w:t xml:space="preserve">I have begun work on an audio drama project with at least 40 people involved. </w:t>
-      </w:r>
-      <w:r>
-        <w:rPr/>
-        <w:t>The score is going to include a choir that me and the project lead will be orchestrating.</w:t>
-      </w:r>
-    </w:p>
-    <w:p xmlns:wp14="http://schemas.microsoft.com/office/word/2010/wordml" wp14:textId="77777777">
-      <w:pPr>
-        <w:pStyle w:val="Normal"/>
-        <w:spacing w:before="0" w:after="142" w:line="259" w:lineRule="auto"/>
-        <w:ind w:left="-5" w:right="0" w:hanging="10"/>
+        <w:ind w:hanging="360" w:left="705" w:right="0"/>
+        <w:rPr/>
+      </w:pPr>
+      <w:r>
+        <w:rPr/>
+        <w:t>I have begun work on an audio drama project with at least 40 people involved. The score is going to include a choir that me and the project lead will be orchestrating.</w:t>
+      </w:r>
+    </w:p>
+    <w:p>
+      <w:pPr>
+        <w:pStyle w:val="Normal"/>
+        <w:spacing w:lineRule="auto" w:line="259" w:before="0" w:after="142"/>
+        <w:ind w:hanging="10" w:left="-5" w:right="0"/>
         <w:rPr/>
       </w:pPr>
       <w:r>
         <w:rPr/>
         <w:t>10/</w:t>
       </w:r>
-      <w:bookmarkStart w:name="_Int_89N34IBL" w:id="1"/>
+      <w:bookmarkStart w:id="1" w:name="_Int_89N34IBL"/>
       <w:r>
         <w:rPr/>
         <w:t xml:space="preserve">25  </w:t>
@@ -803,7 +644,7 @@
         <w:t>10</w:t>
       </w:r>
     </w:p>
-    <w:p xmlns:wp14="http://schemas.microsoft.com/office/word/2010/wordml" wp14:textId="3BBAA472">
+    <w:p>
       <w:pPr>
         <w:pStyle w:val="Normal"/>
         <w:numPr>
@@ -811,7 +652,7 @@
           <w:numId w:val="3"/>
         </w:numPr>
         <w:spacing w:before="0" w:after="266"/>
-        <w:ind w:left="705" w:right="0" w:hanging="360"/>
+        <w:ind w:hanging="360" w:left="705" w:right="0"/>
         <w:rPr/>
       </w:pPr>
       <w:r>
@@ -819,14 +660,14 @@
         <w:t>Work experience with the AV Engineers at dock10 involved collaborating within an ongoing TV production set (1% Club &amp; Countdown). I ensured that equipment was functioning correctly (if not, we would conduct repairs). During my time here, we routed signals from studios to the correct control rooms whilst checking the health of signal paths to exterior junction boxes.</w:t>
       </w:r>
     </w:p>
-    <w:p xmlns:wp14="http://schemas.microsoft.com/office/word/2010/wordml" wp14:textId="77777777">
-      <w:pPr>
-        <w:pStyle w:val="Normal"/>
-        <w:spacing w:before="0" w:after="142" w:line="259" w:lineRule="auto"/>
-        <w:ind w:left="-5" w:right="0" w:hanging="10"/>
-        <w:rPr>
-          <w:b w:val="1"/>
-          <w:bCs w:val="1"/>
+    <w:p>
+      <w:pPr>
+        <w:pStyle w:val="Normal"/>
+        <w:spacing w:lineRule="auto" w:line="259" w:before="0" w:after="142"/>
+        <w:ind w:hanging="10" w:left="-5" w:right="0"/>
+        <w:rPr>
+          <w:b/>
+          <w:bCs/>
           <w:color w:val="auto"/>
         </w:rPr>
       </w:pPr>
@@ -838,14 +679,14 @@
       </w:r>
       <w:r>
         <w:rPr>
-          <w:b w:val="1"/>
-          <w:bCs w:val="1"/>
+          <w:b/>
+          <w:bCs/>
           <w:color w:val="auto"/>
         </w:rPr>
         <w:t xml:space="preserve"> British Heart Foundation, Manchester Piccadilly</w:t>
       </w:r>
     </w:p>
-    <w:p xmlns:wp14="http://schemas.microsoft.com/office/word/2010/wordml" wp14:textId="16E56246">
+    <w:p>
       <w:pPr>
         <w:pStyle w:val="Normal"/>
         <w:numPr>
@@ -853,60 +694,30 @@
           <w:numId w:val="3"/>
         </w:numPr>
         <w:spacing w:before="0" w:after="266"/>
-        <w:ind w:left="705" w:right="0" w:hanging="360"/>
-        <w:rPr>
-          <w:color w:val="auto"/>
-        </w:rPr>
-      </w:pPr>
-      <w:r>
-        <w:rPr>
-          <w:color w:val="auto"/>
-        </w:rPr>
-        <w:t>I learned vital teamworking skills whilst help</w:t>
-      </w:r>
-      <w:r>
-        <w:rPr>
-          <w:color w:val="auto"/>
-        </w:rPr>
-        <w:t>ing</w:t>
-      </w:r>
-      <w:r>
-        <w:rPr>
-          <w:color w:val="auto"/>
-        </w:rPr>
-        <w:t xml:space="preserve"> </w:t>
-      </w:r>
-      <w:r>
-        <w:rPr>
-          <w:color w:val="auto"/>
-        </w:rPr>
-        <w:t xml:space="preserve">a variety of different </w:t>
-      </w:r>
-      <w:r>
-        <w:rPr>
-          <w:color w:val="auto"/>
-        </w:rPr>
-        <w:t>customers with their needs. I enjoyed meeting the different people who walked through the door</w:t>
-      </w:r>
-      <w:r>
-        <w:rPr>
-          <w:color w:val="auto"/>
-        </w:rPr>
-        <w:t>.</w:t>
-      </w:r>
-    </w:p>
-    <w:p xmlns:wp14="http://schemas.microsoft.com/office/word/2010/wordml" wp14:textId="77777777">
-      <w:pPr>
-        <w:pStyle w:val="Normal"/>
-        <w:spacing w:before="0" w:after="142" w:line="259" w:lineRule="auto"/>
-        <w:ind w:left="-5" w:right="0" w:hanging="10"/>
+        <w:ind w:hanging="360" w:left="705" w:right="0"/>
+        <w:rPr>
+          <w:color w:val="auto"/>
+        </w:rPr>
+      </w:pPr>
+      <w:r>
+        <w:rPr>
+          <w:color w:val="auto"/>
+        </w:rPr>
+        <w:t>I learned vital teamworking skills whilst helping a variety of different customers with their needs. I enjoyed meeting the different people who walked through the door.</w:t>
+      </w:r>
+    </w:p>
+    <w:p>
+      <w:pPr>
+        <w:pStyle w:val="Normal"/>
+        <w:spacing w:lineRule="auto" w:line="259" w:before="0" w:after="142"/>
+        <w:ind w:hanging="10" w:left="-5" w:right="0"/>
         <w:rPr/>
       </w:pPr>
       <w:r>
         <w:rPr/>
         <w:t>10/21</w:t>
       </w:r>
-      <w:bookmarkStart w:name="_Hlk204967339" w:id="2"/>
+      <w:bookmarkStart w:id="2" w:name="_Hlk204967339"/>
       <w:r>
         <w:rPr/>
         <w:t>–</w:t>
@@ -918,8 +729,8 @@
       </w:r>
       <w:r>
         <w:rPr>
-          <w:b w:val="1"/>
-          <w:bCs w:val="1"/>
+          <w:b/>
+          <w:bCs/>
         </w:rPr>
         <w:t xml:space="preserve"> Boysen B</w:t>
       </w:r>
@@ -933,37 +744,21 @@
         </w:numPr>
         <w:suppressLineNumbers w:val="0"/>
         <w:bidi w:val="0"/>
-        <w:spacing w:before="0" w:beforeAutospacing="off" w:after="142" w:afterAutospacing="off" w:line="259" w:lineRule="auto"/>
-        <w:ind w:left="705" w:right="0" w:hanging="370"/>
+        <w:spacing w:lineRule="auto" w:line="259" w:beforeAutospacing="0" w:before="0" w:afterAutospacing="0" w:after="142"/>
+        <w:ind w:hanging="370" w:left="705" w:right="0"/>
         <w:jc w:val="left"/>
         <w:rPr/>
       </w:pPr>
       <w:r>
         <w:rPr/>
-        <w:t xml:space="preserve">As a team of </w:t>
-      </w:r>
-      <w:r>
-        <w:rPr/>
-        <w:t>five</w:t>
-      </w:r>
-      <w:r>
-        <w:rPr/>
-        <w:t xml:space="preserve"> we were given a brief to create a fictional climate change website that calculated contributions and the impact they </w:t>
-      </w:r>
-      <w:r>
-        <w:rPr/>
-        <w:t>would have</w:t>
-      </w:r>
-      <w:r>
-        <w:rPr/>
-        <w:t>.</w:t>
-      </w:r>
-    </w:p>
-    <w:p xmlns:wp14="http://schemas.microsoft.com/office/word/2010/wordml" wp14:textId="77777777">
-      <w:pPr>
-        <w:pStyle w:val="Normal"/>
-        <w:spacing w:before="0" w:after="142" w:line="259" w:lineRule="auto"/>
-        <w:ind w:left="-5" w:right="0" w:hanging="10"/>
+        <w:t>As a team of five we were given a brief to create a fictional climate change website that calculated contributions and the impact they would have.</w:t>
+      </w:r>
+    </w:p>
+    <w:p>
+      <w:pPr>
+        <w:pStyle w:val="Normal"/>
+        <w:spacing w:lineRule="auto" w:line="259" w:before="0" w:after="142"/>
+        <w:ind w:hanging="10" w:left="-5" w:right="0"/>
         <w:rPr/>
       </w:pPr>
       <w:r>
@@ -977,7 +772,7 @@
         <w:t xml:space="preserve"> DFDS Seaways </w:t>
       </w:r>
     </w:p>
-    <w:p xmlns:wp14="http://schemas.microsoft.com/office/word/2010/wordml" wp14:textId="5A50D7EA">
+    <w:p>
       <w:pPr>
         <w:pStyle w:val="Normal"/>
         <w:numPr>
@@ -985,66 +780,18 @@
           <w:numId w:val="3"/>
         </w:numPr>
         <w:spacing w:before="0" w:after="230"/>
-        <w:ind w:left="705" w:right="0" w:hanging="360"/>
-        <w:rPr/>
-      </w:pPr>
-      <w:r>
-        <w:rPr/>
-        <w:t xml:space="preserve">This </w:t>
-      </w:r>
-      <w:r>
-        <w:rPr/>
-        <w:t>internship</w:t>
-      </w:r>
-      <w:r>
-        <w:rPr/>
-        <w:t xml:space="preserve"> </w:t>
-      </w:r>
-      <w:r>
-        <w:rPr/>
-        <w:t>focused primarily on</w:t>
-      </w:r>
-      <w:r>
-        <w:rPr/>
-        <w:t xml:space="preserve"> technical support. </w:t>
-      </w:r>
-      <w:r>
-        <w:rPr/>
-        <w:t xml:space="preserve">As they </w:t>
-      </w:r>
-      <w:r>
-        <w:rPr/>
-        <w:t>were responsible</w:t>
-      </w:r>
-      <w:r>
-        <w:rPr/>
-        <w:t xml:space="preserve"> </w:t>
-      </w:r>
-      <w:r>
-        <w:rPr/>
-        <w:t>for</w:t>
-      </w:r>
-      <w:r>
-        <w:rPr/>
-        <w:t xml:space="preserve"> the entire port’s upkeep</w:t>
-      </w:r>
-      <w:r>
-        <w:rPr/>
-        <w:t>, it</w:t>
-      </w:r>
-      <w:r>
-        <w:rPr/>
-        <w:t xml:space="preserve"> required me to be on call with</w:t>
-      </w:r>
-      <w:r>
-        <w:rPr/>
-        <w:t xml:space="preserve"> dispatch which has furthered my confidence in communicating with specialised vocabulary whilst problem-solving.</w:t>
-      </w:r>
-    </w:p>
-    <w:p xmlns:wp14="http://schemas.microsoft.com/office/word/2010/wordml" wp14:textId="77777777">
+        <w:ind w:hanging="360" w:left="705" w:right="0"/>
+        <w:rPr/>
+      </w:pPr>
+      <w:r>
+        <w:rPr/>
+        <w:t>This internship focused primarily on technical support. As they were responsible for the entire port’s upkeep, it required me to be on call with dispatch which has furthered my confidence in communicating with specialised vocabulary whilst problem-solving.</w:t>
+      </w:r>
+    </w:p>
+    <w:p>
       <w:pPr>
         <w:pStyle w:val="Heading1"/>
-        <w:ind w:left="-5" w:hanging="10"/>
+        <w:ind w:hanging="10" w:left="-5"/>
         <w:rPr/>
       </w:pPr>
       <w:r>
@@ -1052,15 +799,15 @@
         <w:t>RELEVANT INTERESTS</w:t>
       </w:r>
     </w:p>
-    <w:p xmlns:wp14="http://schemas.microsoft.com/office/word/2010/wordml" wp14:textId="77777777">
+    <w:p>
       <w:pPr>
         <w:pStyle w:val="Normal"/>
         <w:tabs>
           <w:tab w:val="clear" w:pos="720"/>
-          <w:tab w:val="center" w:leader="none" w:pos="2959"/>
-        </w:tabs>
-        <w:spacing w:before="0" w:after="142" w:line="259" w:lineRule="auto"/>
-        <w:ind w:left="-15" w:right="0" w:hanging="0"/>
+          <w:tab w:val="center" w:pos="2959" w:leader="none"/>
+        </w:tabs>
+        <w:spacing w:lineRule="auto" w:line="259" w:before="0" w:after="142"/>
+        <w:ind w:hanging="0" w:left="-15" w:right="0"/>
         <w:rPr/>
       </w:pPr>
       <w:r>
@@ -1069,8 +816,8 @@
       </w:r>
       <w:r>
         <w:rPr>
-          <w:b w:val="1"/>
-          <w:bCs w:val="1"/>
+          <w:b/>
+          <w:bCs/>
         </w:rPr>
         <w:t xml:space="preserve"> Society Member</w:t>
       </w:r>
@@ -1084,8 +831,8 @@
         </w:numPr>
         <w:suppressLineNumbers w:val="0"/>
         <w:bidi w:val="0"/>
-        <w:spacing w:before="0" w:beforeAutospacing="off" w:after="5" w:afterAutospacing="off" w:line="247" w:lineRule="auto"/>
-        <w:ind w:left="705" w:right="0" w:hanging="360"/>
+        <w:spacing w:lineRule="auto" w:line="247" w:beforeAutospacing="0" w:before="0" w:afterAutospacing="0" w:after="0"/>
+        <w:ind w:hanging="360" w:left="705" w:right="0"/>
         <w:jc w:val="left"/>
         <w:rPr>
           <w:color w:val="auto"/>
@@ -1095,22 +842,10 @@
         <w:rPr>
           <w:color w:val="auto"/>
         </w:rPr>
-        <w:t xml:space="preserve">I attended Film Society social gatherings and </w:t>
-      </w:r>
-      <w:r>
-        <w:rPr>
-          <w:color w:val="auto"/>
-        </w:rPr>
-        <w:t xml:space="preserve">one-off </w:t>
-      </w:r>
-      <w:r>
-        <w:rPr>
-          <w:color w:val="auto"/>
-        </w:rPr>
-        <w:t>orchestral screenings.</w:t>
-      </w:r>
-    </w:p>
-    <w:p xmlns:wp14="http://schemas.microsoft.com/office/word/2010/wordml" wp14:textId="72854325">
+        <w:t>I attended Film Society social gatherings and one-off orchestral screenings.</w:t>
+      </w:r>
+    </w:p>
+    <w:p>
       <w:pPr>
         <w:pStyle w:val="Normal"/>
         <w:numPr>
@@ -1118,7 +853,7 @@
           <w:numId w:val="4"/>
         </w:numPr>
         <w:spacing w:before="0" w:after="292"/>
-        <w:ind w:left="705" w:right="0" w:hanging="360"/>
+        <w:ind w:hanging="360" w:left="705" w:right="0"/>
         <w:rPr>
           <w:color w:val="auto"/>
         </w:rPr>
@@ -1130,34 +865,28 @@
         <w:t>I lead a Photography Society at university that averaged 20 members.</w:t>
       </w:r>
     </w:p>
-    <w:p xmlns:wp14="http://schemas.microsoft.com/office/word/2010/wordml" wp14:textId="77777777">
+    <w:p>
       <w:pPr>
         <w:pStyle w:val="Heading1"/>
-        <w:ind w:left="-5" w:hanging="10"/>
+        <w:ind w:hanging="10" w:left="-5"/>
         <w:rPr/>
       </w:pPr>
       <w:r>
         <w:rPr/>
         <w:t>ADDITIONAL SKILLS</w:t>
-      </w:r>
-      <w:r>
-        <w:rPr/>
         <w:tab/>
-      </w:r>
-      <w:r>
-        <w:rPr/>
         <w:t xml:space="preserve"> </w:t>
       </w:r>
     </w:p>
-    <w:p xmlns:wp14="http://schemas.microsoft.com/office/word/2010/wordml" wp14:textId="2CA4E431">
+    <w:p>
       <w:pPr>
         <w:pStyle w:val="Normal"/>
         <w:numPr>
           <w:ilvl w:val="0"/>
           <w:numId w:val="5"/>
         </w:numPr>
-        <w:spacing w:before="0" w:after="0" w:line="240" w:lineRule="auto"/>
-        <w:ind w:left="705" w:right="0" w:hanging="370"/>
+        <w:spacing w:lineRule="auto" w:line="240" w:before="0" w:after="0"/>
+        <w:ind w:hanging="370" w:left="705" w:right="0"/>
         <w:rPr>
           <w:rFonts w:eastAsia="Times New Roman"/>
           <w:color w:val="auto"/>
@@ -1172,45 +901,18 @@
           <w:kern w:val="0"/>
           <w14:ligatures w14:val="none"/>
         </w:rPr>
-        <w:t xml:space="preserve">I have </w:t>
-      </w:r>
-      <w:r>
-        <w:rPr>
-          <w:rFonts w:eastAsia="Times New Roman"/>
-          <w:color w:val="auto"/>
-          <w:kern w:val="0"/>
-          <w14:ligatures w14:val="none"/>
-        </w:rPr>
-        <w:t xml:space="preserve">over </w:t>
-      </w:r>
-      <w:r>
-        <w:rPr>
-          <w:rFonts w:eastAsia="Times New Roman"/>
-          <w:color w:val="auto"/>
-          <w:kern w:val="0"/>
-          <w14:ligatures w14:val="none"/>
-        </w:rPr>
-        <w:t xml:space="preserve">4 years of continuous experience using audio editing software such as Logic Pro and Reaper</w:t>
-      </w:r>
-      <w:r>
-        <w:rPr>
-          <w:rFonts w:eastAsia="Times New Roman"/>
-          <w:color w:val="auto"/>
-          <w:kern w:val="0"/>
-          <w14:ligatures w14:val="none"/>
-        </w:rPr>
-        <w:t xml:space="preserve">.</w:t>
-      </w:r>
-    </w:p>
-    <w:p xmlns:wp14="http://schemas.microsoft.com/office/word/2010/wordml" wp14:textId="77777777">
+        <w:t>I have over 4 years of continuous experience using audio editing software such as Logic Pro and Reaper.</w:t>
+      </w:r>
+    </w:p>
+    <w:p>
       <w:pPr>
         <w:pStyle w:val="Normal"/>
         <w:numPr>
           <w:ilvl w:val="0"/>
           <w:numId w:val="5"/>
         </w:numPr>
-        <w:spacing w:before="0" w:after="0" w:line="240" w:lineRule="auto"/>
-        <w:ind w:left="705" w:right="0" w:hanging="370"/>
+        <w:spacing w:lineRule="auto" w:line="240" w:before="0" w:after="0"/>
+        <w:ind w:hanging="370" w:left="705" w:right="0"/>
         <w:rPr>
           <w:rFonts w:eastAsia="Times New Roman"/>
           <w:color w:val="auto"/>
@@ -1228,51 +930,35 @@
         <w:t>I enjoy soldering/DIY electronics and using this to experiment with different sound design approaches and audio processing (similar to re-amping).</w:t>
       </w:r>
     </w:p>
-    <w:p xmlns:wp14="http://schemas.microsoft.com/office/word/2010/wordml" wp14:textId="3486E577">
+    <w:p>
       <w:pPr>
         <w:pStyle w:val="Normal"/>
         <w:numPr>
           <w:ilvl w:val="0"/>
           <w:numId w:val="5"/>
         </w:numPr>
-        <w:ind w:left="705" w:right="0" w:hanging="360"/>
-        <w:rPr/>
-      </w:pPr>
-      <w:r>
-        <w:rPr/>
-        <w:t xml:space="preserve">I </w:t>
-      </w:r>
-      <w:r>
-        <w:rPr/>
-        <w:t>frequently</w:t>
-      </w:r>
-      <w:r>
-        <w:rPr/>
-        <w:t xml:space="preserve"> self-host my own web services on my home server, this has taught me a lot about Linux troubleshooting, </w:t>
-      </w:r>
-      <w:r>
-        <w:rPr/>
-        <w:t>scripting</w:t>
-      </w:r>
-      <w:r>
-        <w:rPr/>
-        <w:t xml:space="preserve"> and security </w:t>
-      </w:r>
-      <w:r>
-        <w:rPr/>
-        <w:t xml:space="preserve">hardening. </w:t>
-      </w:r>
-    </w:p>
-    <w:p xmlns:wp14="http://schemas.microsoft.com/office/word/2010/wordml" wp14:textId="77777777">
-      <w:pPr>
-        <w:pStyle w:val="Normal"/>
-        <w:ind w:left="2880" w:right="0" w:hanging="0"/>
-      </w:pPr>
-    </w:p>
-    <w:p xmlns:wp14="http://schemas.microsoft.com/office/word/2010/wordml" wp14:textId="77777777">
+        <w:ind w:hanging="360" w:left="705" w:right="0"/>
+        <w:rPr/>
+      </w:pPr>
+      <w:r>
+        <w:rPr/>
+        <w:t xml:space="preserve">I frequently self-host my own web services on my home server, this has taught me a lot about Linux troubleshooting, scripting and security hardening. </w:t>
+      </w:r>
+    </w:p>
+    <w:p>
+      <w:pPr>
+        <w:pStyle w:val="Normal"/>
+        <w:ind w:hanging="0" w:left="2880" w:right="0"/>
+        <w:rPr/>
+      </w:pPr>
+      <w:r>
+        <w:rPr/>
+      </w:r>
+    </w:p>
+    <w:p>
       <w:pPr>
         <w:pStyle w:val="Heading1"/>
-        <w:ind w:left="-5" w:hanging="10"/>
+        <w:ind w:hanging="10" w:left="-5"/>
         <w:rPr/>
       </w:pPr>
       <w:r>
@@ -1280,52 +966,38 @@
         <w:t>INTERESTS AND ACTIVITIES</w:t>
       </w:r>
     </w:p>
-    <w:p xmlns:wp14="http://schemas.microsoft.com/office/word/2010/wordml" wp14:textId="6C8D8697">
+    <w:p>
       <w:pPr>
         <w:pStyle w:val="Normal"/>
         <w:spacing w:before="0" w:after="268"/>
-        <w:ind w:left="0" w:right="0" w:hanging="0"/>
-      </w:pPr>
-      <w:r>
-        <w:rPr/>
-        <w:t xml:space="preserve">I am a polite, well-mannered, punctual individual who enjoys meeting lots of different people. I love expanding my photography </w:t>
-      </w:r>
-      <w:r>
-        <w:rPr/>
-        <w:t xml:space="preserve">portfolio </w:t>
-      </w:r>
-      <w:r>
-        <w:rPr/>
-        <w:t>and</w:t>
-      </w:r>
-      <w:r>
-        <w:rPr/>
-        <w:t xml:space="preserve"> researching about </w:t>
-      </w:r>
-      <w:r>
-        <w:rPr/>
-        <w:t>broadcast/music history.</w:t>
-      </w:r>
-    </w:p>
-    <w:p xmlns:wp14="http://schemas.microsoft.com/office/word/2010/wordml" wp14:textId="77777777">
+        <w:ind w:hanging="0" w:left="0" w:right="0"/>
+        <w:rPr/>
+      </w:pPr>
+      <w:r>
+        <w:rPr/>
+        <w:t>I am a polite, well-mannered, punctual individual who enjoys meeting lots of different people. I love expanding my photography portfolio and researching about broadcast/music history.</w:t>
+      </w:r>
+    </w:p>
+    <w:p>
       <w:pPr>
         <w:pStyle w:val="Heading1"/>
-        <w:ind w:left="-15" w:hanging="0"/>
+        <w:ind w:hanging="0" w:left="-15"/>
+        <w:rPr/>
       </w:pPr>
       <w:r>
         <w:rPr/>
         <w:t>CHARACTER REFERENCES</w:t>
       </w:r>
     </w:p>
-    <w:p xmlns:wp14="http://schemas.microsoft.com/office/word/2010/wordml" wp14:textId="77777777">
+    <w:p>
       <w:pPr>
         <w:pStyle w:val="ListParagraph"/>
         <w:numPr>
           <w:ilvl w:val="0"/>
           <w:numId w:val="1"/>
         </w:numPr>
-        <w:spacing w:before="0" w:after="0" w:afterAutospacing="0" w:line="259" w:lineRule="auto"/>
-        <w:ind w:left="720" w:right="0" w:hanging="360"/>
+        <w:spacing w:lineRule="auto" w:line="259" w:before="0" w:afterAutospacing="0" w:after="0"/>
+        <w:ind w:hanging="360" w:left="720" w:right="0"/>
         <w:contextualSpacing/>
         <w:jc w:val="left"/>
         <w:rPr>
@@ -1337,7 +1009,7 @@
           <w:iCs w:val="false"/>
           <w:caps w:val="false"/>
           <w:smallCaps w:val="false"/>
-          <w:color w:val="auto" w:themeColor="text1"/>
+          <w:color w:themeColor="text1" w:val="auto"/>
           <w:sz w:val="24"/>
           <w:szCs w:val="24"/>
           <w:lang w:val="en-GB"/>
@@ -1376,11 +1048,11 @@
         <w:t xml:space="preserve"> – Programme Leader for Computing at Grimsby Institute of Further &amp; Higher Education. </w:t>
       </w:r>
     </w:p>
-    <w:p xmlns:wp14="http://schemas.microsoft.com/office/word/2010/wordml" wp14:textId="77777777">
-      <w:pPr>
-        <w:pStyle w:val="Normal"/>
-        <w:spacing w:before="0" w:after="0" w:afterAutospacing="0" w:line="259" w:lineRule="auto"/>
-        <w:ind w:left="735" w:right="0" w:hanging="0"/>
+    <w:p>
+      <w:pPr>
+        <w:pStyle w:val="Normal"/>
+        <w:spacing w:lineRule="auto" w:line="259" w:before="0" w:afterAutospacing="0" w:after="0"/>
+        <w:ind w:hanging="0" w:left="735" w:right="0"/>
         <w:jc w:val="left"/>
         <w:rPr>
           <w:rFonts w:ascii="Arial" w:hAnsi="Arial" w:eastAsia="Arial" w:cs="Arial"/>
@@ -1413,7 +1085,7 @@
         </w:rPr>
         <w:t xml:space="preserve">Email Address: </w:t>
       </w:r>
-      <w:hyperlink r:id="rId5">
+      <w:hyperlink r:id="rId4">
         <w:r>
           <w:rPr>
             <w:rStyle w:val="Hyperlink"/>
@@ -1435,15 +1107,15 @@
         </w:r>
       </w:hyperlink>
     </w:p>
-    <w:p xmlns:wp14="http://schemas.microsoft.com/office/word/2010/wordml" wp14:textId="77777777">
+    <w:p>
       <w:pPr>
         <w:pStyle w:val="ListParagraph"/>
         <w:numPr>
           <w:ilvl w:val="0"/>
           <w:numId w:val="1"/>
         </w:numPr>
-        <w:spacing w:before="0" w:after="0" w:afterAutospacing="0" w:line="259" w:lineRule="auto"/>
-        <w:ind w:left="720" w:right="0" w:hanging="360"/>
+        <w:spacing w:lineRule="auto" w:line="259" w:before="0" w:afterAutospacing="0" w:after="0"/>
+        <w:ind w:hanging="360" w:left="720" w:right="0"/>
         <w:contextualSpacing/>
         <w:jc w:val="left"/>
         <w:rPr>
@@ -1497,11 +1169,11 @@
         <w:t xml:space="preserve"> – Manager for British Heart Foundation, Manchester Piccadilly.</w:t>
       </w:r>
     </w:p>
-    <w:p xmlns:wp14="http://schemas.microsoft.com/office/word/2010/wordml" wp14:textId="77777777">
-      <w:pPr>
-        <w:pStyle w:val="Normal"/>
-        <w:spacing w:before="0" w:after="0" w:afterAutospacing="0" w:line="259" w:lineRule="auto"/>
-        <w:ind w:left="735" w:right="0" w:hanging="0"/>
+    <w:p>
+      <w:pPr>
+        <w:pStyle w:val="Normal"/>
+        <w:spacing w:lineRule="auto" w:line="259" w:before="0" w:afterAutospacing="0" w:after="0"/>
+        <w:ind w:hanging="0" w:left="735" w:right="0"/>
         <w:jc w:val="left"/>
         <w:rPr>
           <w:rFonts w:ascii="Arial" w:hAnsi="Arial" w:eastAsia="Arial" w:cs="Arial"/>
@@ -1537,7 +1209,7 @@
         </w:rPr>
         <w:t xml:space="preserve">Email Address: </w:t>
       </w:r>
-      <w:hyperlink r:id="rId6">
+      <w:hyperlink r:id="rId5">
         <w:r>
           <w:rPr>
             <w:rStyle w:val="Hyperlink"/>
@@ -1559,15 +1231,15 @@
         </w:r>
       </w:hyperlink>
     </w:p>
-    <w:p xmlns:wp14="http://schemas.microsoft.com/office/word/2010/wordml" wp14:textId="77777777">
+    <w:p>
       <w:pPr>
         <w:pStyle w:val="ListParagraph"/>
         <w:numPr>
           <w:ilvl w:val="0"/>
           <w:numId w:val="1"/>
         </w:numPr>
-        <w:spacing w:before="0" w:after="0" w:afterAutospacing="0" w:line="259" w:lineRule="auto"/>
-        <w:ind w:left="720" w:right="0" w:hanging="360"/>
+        <w:spacing w:lineRule="auto" w:line="259" w:before="0" w:afterAutospacing="0" w:after="0"/>
+        <w:ind w:hanging="360" w:left="720" w:right="0"/>
         <w:contextualSpacing/>
         <w:jc w:val="left"/>
         <w:rPr>
@@ -1618,11 +1290,11 @@
         <w:t xml:space="preserve"> – Music &amp; Sound Lecturer at Manchester Metropolitan University. </w:t>
       </w:r>
     </w:p>
-    <w:p xmlns:wp14="http://schemas.microsoft.com/office/word/2010/wordml" wp14:textId="77777777">
-      <w:pPr>
-        <w:pStyle w:val="Normal"/>
-        <w:spacing w:before="0" w:after="0" w:afterAutospacing="0" w:line="259" w:lineRule="auto"/>
-        <w:ind w:left="735" w:right="0" w:hanging="0"/>
+    <w:p>
+      <w:pPr>
+        <w:pStyle w:val="Normal"/>
+        <w:spacing w:lineRule="auto" w:line="259" w:before="0" w:afterAutospacing="0" w:after="0"/>
+        <w:ind w:hanging="0" w:left="735" w:right="0"/>
         <w:jc w:val="left"/>
         <w:rPr>
           <w:rFonts w:ascii="Arial" w:hAnsi="Arial" w:eastAsia="Arial" w:cs="Arial"/>
@@ -1658,15 +1330,15 @@
         <w:t>Email Address: n.bruce@mmu.ac.uk</w:t>
       </w:r>
     </w:p>
-    <w:p xmlns:wp14="http://schemas.microsoft.com/office/word/2010/wordml" wp14:textId="77777777">
+    <w:p>
       <w:pPr>
         <w:pStyle w:val="ListParagraph"/>
         <w:numPr>
           <w:ilvl w:val="0"/>
           <w:numId w:val="1"/>
         </w:numPr>
-        <w:spacing w:before="0" w:after="0" w:afterAutospacing="0" w:line="259" w:lineRule="auto"/>
-        <w:ind w:left="720" w:right="0" w:hanging="360"/>
+        <w:spacing w:lineRule="auto" w:line="259" w:before="0" w:afterAutospacing="0" w:after="0"/>
+        <w:ind w:hanging="360" w:left="720" w:right="0"/>
         <w:contextualSpacing/>
         <w:jc w:val="left"/>
         <w:rPr>
@@ -1717,11 +1389,11 @@
         <w:t>– Music &amp; Sound Lecturer at Manchester Metropolitan University.</w:t>
       </w:r>
     </w:p>
-    <w:p xmlns:wp14="http://schemas.microsoft.com/office/word/2010/wordml" wp14:textId="77777777">
-      <w:pPr>
-        <w:pStyle w:val="Normal"/>
-        <w:spacing w:before="0" w:after="3" w:line="259" w:lineRule="auto"/>
-        <w:ind w:left="730" w:right="0" w:hanging="10"/>
+    <w:p>
+      <w:pPr>
+        <w:pStyle w:val="Normal"/>
+        <w:spacing w:lineRule="auto" w:line="259" w:before="0" w:after="3"/>
+        <w:ind w:hanging="10" w:left="730" w:right="0"/>
         <w:jc w:val="left"/>
         <w:rPr>
           <w:rFonts w:ascii="Noto Sans" w:hAnsi="Noto Sans" w:eastAsia="Noto Sans" w:cs="Noto Sans"/>
@@ -1754,11 +1426,11 @@
         </w:rPr>
         <w:t xml:space="preserve">Email: </w:t>
       </w:r>
-      <w:hyperlink r:id="rId7">
+      <w:hyperlink r:id="rId6">
         <w:r>
           <w:rPr>
             <w:rStyle w:val="Hyperlink"/>
-            <w:rFonts w:ascii="Noto Sans" w:hAnsi="Noto Sans" w:eastAsia="Noto Sans" w:cs="Noto Sans"/>
+            <w:rFonts w:eastAsia="Noto Sans" w:cs="Noto Sans" w:ascii="Noto Sans" w:hAnsi="Noto Sans"/>
             <w:b w:val="false"/>
             <w:bCs w:val="false"/>
             <w:i w:val="false"/>
@@ -1776,11 +1448,11 @@
         </w:r>
       </w:hyperlink>
     </w:p>
-    <w:p xmlns:wp14="http://schemas.microsoft.com/office/word/2010/wordml" wp14:textId="77777777">
-      <w:pPr>
-        <w:pStyle w:val="Normal"/>
-        <w:spacing w:before="0" w:after="3" w:line="259" w:lineRule="auto"/>
-        <w:ind w:left="730" w:right="0" w:hanging="10"/>
+    <w:p>
+      <w:pPr>
+        <w:pStyle w:val="Normal"/>
+        <w:spacing w:lineRule="auto" w:line="259" w:before="0" w:after="3"/>
+        <w:ind w:hanging="10" w:left="730" w:right="0"/>
         <w:jc w:val="left"/>
         <w:rPr>
           <w:rFonts w:ascii="Noto Sans" w:hAnsi="Noto Sans" w:eastAsia="Noto Sans" w:cs="Noto Sans"/>
@@ -1815,7 +1487,7 @@
       </w:r>
       <w:r>
         <w:rPr>
-          <w:rFonts w:ascii="Noto Sans" w:hAnsi="Noto Sans" w:eastAsia="Noto Sans" w:cs="Noto Sans"/>
+          <w:rFonts w:eastAsia="Noto Sans" w:cs="Noto Sans" w:ascii="Noto Sans" w:hAnsi="Noto Sans"/>
           <w:b w:val="false"/>
           <w:bCs w:val="false"/>
           <w:i w:val="false"/>
@@ -1833,15 +1505,15 @@
         <w:t>+44 (0)161 247 2000</w:t>
       </w:r>
     </w:p>
-    <w:p xmlns:wp14="http://schemas.microsoft.com/office/word/2010/wordml" wp14:textId="77777777">
+    <w:p>
       <w:pPr>
         <w:pStyle w:val="ListParagraph"/>
         <w:numPr>
           <w:ilvl w:val="0"/>
           <w:numId w:val="1"/>
         </w:numPr>
-        <w:spacing w:before="0" w:after="0" w:afterAutospacing="0" w:line="259" w:lineRule="auto"/>
-        <w:ind w:left="720" w:right="0" w:hanging="360"/>
+        <w:spacing w:lineRule="auto" w:line="259" w:before="0" w:afterAutospacing="0" w:after="0"/>
+        <w:ind w:hanging="360" w:left="720" w:right="0"/>
         <w:contextualSpacing/>
         <w:jc w:val="left"/>
         <w:rPr>
@@ -1892,13 +1564,13 @@
         <w:t>– Senior Broadcast Engineer at dock10.</w:t>
       </w:r>
     </w:p>
-    <w:p xmlns:wp14="http://schemas.microsoft.com/office/word/2010/wordml" wp14:textId="77777777">
+    <w:p>
       <w:pPr>
         <w:pStyle w:val="Normal"/>
         <w:suppressLineNumbers w:val="0"/>
         <w:bidi w:val="0"/>
-        <w:spacing w:before="0" w:beforeAutospacing="0" w:after="3" w:afterAutospacing="0" w:line="259" w:lineRule="auto"/>
-        <w:ind w:left="730" w:right="0" w:hanging="10"/>
+        <w:spacing w:lineRule="auto" w:line="259" w:beforeAutospacing="0" w:before="0" w:afterAutospacing="0" w:after="3"/>
+        <w:ind w:hanging="10" w:left="730" w:right="0"/>
         <w:jc w:val="left"/>
         <w:rPr>
           <w:rFonts w:ascii="Noto Sans" w:hAnsi="Noto Sans" w:eastAsia="Noto Sans" w:cs="Noto Sans"/>
@@ -1933,11 +1605,148 @@
         </w:rPr>
         <w:t xml:space="preserve">Email: </w:t>
       </w:r>
-      <w:r>
+      <w:hyperlink r:id="rId7">
+        <w:r>
+          <w:rPr>
+            <w:rStyle w:val="Hyperlink"/>
+            <w:rFonts w:eastAsia="Noto Sans" w:cs="Noto Sans" w:ascii="Noto Sans" w:hAnsi="Noto Sans"/>
+            <w:b w:val="false"/>
+            <w:bCs w:val="false"/>
+            <w:i w:val="false"/>
+            <w:iCs w:val="false"/>
+            <w:caps w:val="false"/>
+            <w:smallCaps w:val="false"/>
+            <w:strike w:val="false"/>
+            <w:dstrike w:val="false"/>
+            <w:color w:val="auto"/>
+            <w:sz w:val="24"/>
+            <w:szCs w:val="24"/>
+            <w:lang w:val="en-GB"/>
+          </w:rPr>
+          <w:t>james.adnitt@dock10.co.uk</w:t>
+        </w:r>
+      </w:hyperlink>
+    </w:p>
+    <w:p>
+      <w:pPr>
+        <w:pStyle w:val="ListParagraph"/>
+        <w:numPr>
+          <w:ilvl w:val="0"/>
+          <w:numId w:val="1"/>
+        </w:numPr>
+        <w:spacing w:lineRule="auto" w:line="259" w:before="0" w:afterAutospacing="0" w:after="0"/>
+        <w:ind w:hanging="360" w:left="720" w:right="0"/>
+        <w:contextualSpacing/>
+        <w:jc w:val="left"/>
+        <w:rPr>
+          <w:rFonts w:ascii="Arial" w:hAnsi="Arial" w:eastAsia="Arial" w:cs="Arial"/>
+          <w:b w:val="false"/>
+          <w:bCs w:val="false"/>
+          <w:i w:val="false"/>
+          <w:i w:val="false"/>
+          <w:iCs w:val="false"/>
+          <w:caps w:val="false"/>
+          <w:smallCaps w:val="false"/>
+          <w:color w:val="auto"/>
+          <w:sz w:val="24"/>
+          <w:szCs w:val="24"/>
+          <w:lang w:val="en-GB"/>
+        </w:rPr>
+      </w:pPr>
+      <w:r>
+        <w:rPr>
+          <w:rFonts w:eastAsia="Arial" w:cs="Arial"/>
+          <w:b/>
+          <w:bCs/>
+          <w:i w:val="false"/>
+          <w:iCs w:val="false"/>
+          <w:caps w:val="false"/>
+          <w:smallCaps w:val="false"/>
+          <w:color w:val="auto"/>
+          <w:sz w:val="24"/>
+          <w:szCs w:val="24"/>
+          <w:lang w:val="en-GB"/>
+        </w:rPr>
+        <w:t>Sam Heitzman</w:t>
+      </w:r>
+      <w:r>
+        <w:rPr>
+          <w:rFonts w:eastAsia="Arial" w:cs="Arial"/>
+          <w:b/>
+          <w:bCs/>
+          <w:i w:val="false"/>
+          <w:iCs w:val="false"/>
+          <w:caps w:val="false"/>
+          <w:smallCaps w:val="false"/>
+          <w:color w:val="auto"/>
+          <w:sz w:val="24"/>
+          <w:szCs w:val="24"/>
+          <w:lang w:val="en-GB"/>
+        </w:rPr>
+        <w:t xml:space="preserve"> </w:t>
+      </w:r>
+      <w:r>
+        <w:rPr>
+          <w:rFonts w:eastAsia="Arial" w:cs="Arial"/>
+          <w:b w:val="false"/>
+          <w:bCs w:val="false"/>
+          <w:i w:val="false"/>
+          <w:iCs w:val="false"/>
+          <w:caps w:val="false"/>
+          <w:smallCaps w:val="false"/>
+          <w:color w:val="auto"/>
+          <w:sz w:val="24"/>
+          <w:szCs w:val="24"/>
+          <w:lang w:val="en-GB"/>
+        </w:rPr>
+        <w:t xml:space="preserve">– </w:t>
+      </w:r>
+      <w:r>
+        <w:rPr>
+          <w:rFonts w:eastAsia="Arial" w:cs="Arial"/>
+          <w:b w:val="false"/>
+          <w:bCs w:val="false"/>
+          <w:i w:val="false"/>
+          <w:iCs w:val="false"/>
+          <w:caps w:val="false"/>
+          <w:smallCaps w:val="false"/>
+          <w:color w:val="auto"/>
+          <w:sz w:val="24"/>
+          <w:szCs w:val="24"/>
+          <w:lang w:val="en-GB"/>
+        </w:rPr>
+        <w:t>Sam Heitzmann Productions/Manchester Basketball</w:t>
+      </w:r>
+      <w:r>
+        <w:rPr>
+          <w:rFonts w:eastAsia="Arial" w:cs="Arial"/>
+          <w:b w:val="false"/>
+          <w:bCs w:val="false"/>
+          <w:i w:val="false"/>
+          <w:iCs w:val="false"/>
+          <w:caps w:val="false"/>
+          <w:smallCaps w:val="false"/>
+          <w:color w:val="auto"/>
+          <w:sz w:val="24"/>
+          <w:szCs w:val="24"/>
+          <w:lang w:val="en-GB"/>
+        </w:rPr>
+        <w:t>.</w:t>
+      </w:r>
+    </w:p>
+    <w:p>
+      <w:pPr>
+        <w:pStyle w:val="Normal"/>
+        <w:suppressLineNumbers w:val="0"/>
+        <w:bidi w:val="0"/>
+        <w:spacing w:lineRule="auto" w:line="259" w:beforeAutospacing="0" w:before="0" w:afterAutospacing="0" w:after="3"/>
+        <w:ind w:hanging="10" w:left="730" w:right="0"/>
+        <w:jc w:val="left"/>
         <w:rPr>
           <w:rFonts w:ascii="Noto Sans" w:hAnsi="Noto Sans" w:eastAsia="Noto Sans" w:cs="Noto Sans"/>
           <w:b w:val="false"/>
           <w:bCs w:val="false"/>
+          <w:i w:val="false"/>
           <w:i w:val="false"/>
           <w:iCs w:val="false"/>
           <w:caps w:val="false"/>
@@ -1949,20 +1758,12 @@
           <w:szCs w:val="24"/>
           <w:lang w:val="en-GB"/>
         </w:rPr>
-        <w:t>james.adnitt@dock10.co.uk</w:t>
-      </w:r>
-    </w:p>
-    <w:p xmlns:wp14="http://schemas.microsoft.com/office/word/2010/wordml" wp14:textId="77777777">
-      <w:pPr>
-        <w:pStyle w:val="Normal"/>
-        <w:spacing w:before="0" w:after="3" w:line="259" w:lineRule="auto"/>
-        <w:ind w:left="730" w:right="0" w:hanging="10"/>
-        <w:jc w:val="left"/>
-        <w:rPr>
-          <w:rFonts w:ascii="Noto Sans" w:hAnsi="Noto Sans" w:eastAsia="Noto Sans" w:cs="Noto Sans"/>
-          <w:b w:val="false"/>
-          <w:bCs w:val="false"/>
-          <w:i w:val="false"/>
+      </w:pPr>
+      <w:r>
+        <w:rPr>
+          <w:rFonts w:eastAsia="Arial" w:cs="Arial" w:ascii="Noto Sans" w:hAnsi="Noto Sans"/>
+          <w:b w:val="false"/>
+          <w:bCs w:val="false"/>
           <w:i w:val="false"/>
           <w:iCs w:val="false"/>
           <w:caps w:val="false"/>
@@ -1972,15 +1773,184 @@
           <w:color w:val="auto"/>
           <w:sz w:val="24"/>
           <w:szCs w:val="24"/>
-          <w:u w:val="single"/>
-          <w:lang w:val="en-GB"/>
-        </w:rPr>
-      </w:pPr>
-      <w:r>
+          <w:lang w:val="en-GB"/>
+        </w:rPr>
+        <w:t xml:space="preserve">Email: </w:t>
+      </w:r>
+      <w:hyperlink r:id="rId9">
+        <w:r>
+          <w:rPr>
+            <w:rStyle w:val="Hyperlink"/>
+            <w:rFonts w:eastAsia="Noto Sans" w:cs="Noto Sans" w:ascii="Noto Sans" w:hAnsi="Noto Sans"/>
+            <w:b w:val="false"/>
+            <w:bCs w:val="false"/>
+            <w:i w:val="false"/>
+            <w:iCs w:val="false"/>
+            <w:caps w:val="false"/>
+            <w:smallCaps w:val="false"/>
+            <w:strike w:val="false"/>
+            <w:dstrike w:val="false"/>
+            <w:color w:val="auto"/>
+            <w:sz w:val="24"/>
+            <w:szCs w:val="24"/>
+            <w:lang w:val="en-GB"/>
+          </w:rPr>
+          <w:t>sam@heitzman.co.uk</w:t>
+        </w:r>
+      </w:hyperlink>
+    </w:p>
+    <w:p>
+      <w:pPr>
+        <w:pStyle w:val="ListParagraph"/>
+        <w:numPr>
+          <w:ilvl w:val="0"/>
+          <w:numId w:val="1"/>
+        </w:numPr>
+        <w:spacing w:lineRule="auto" w:line="259" w:before="0" w:afterAutospacing="0" w:after="0"/>
+        <w:ind w:hanging="360" w:left="720" w:right="0"/>
+        <w:contextualSpacing/>
+        <w:jc w:val="left"/>
+        <w:rPr>
+          <w:rFonts w:ascii="Arial" w:hAnsi="Arial" w:eastAsia="Arial" w:cs="Arial"/>
+          <w:b w:val="false"/>
+          <w:bCs w:val="false"/>
+          <w:i w:val="false"/>
+          <w:i w:val="false"/>
+          <w:iCs w:val="false"/>
+          <w:caps w:val="false"/>
+          <w:smallCaps w:val="false"/>
+          <w:color w:val="auto"/>
+          <w:sz w:val="24"/>
+          <w:szCs w:val="24"/>
+          <w:lang w:val="en-GB"/>
+        </w:rPr>
+      </w:pPr>
+      <w:r>
+        <w:rPr>
+          <w:rFonts w:eastAsia="Arial" w:cs="Arial"/>
+          <w:b/>
+          <w:bCs/>
+          <w:i w:val="false"/>
+          <w:iCs w:val="false"/>
+          <w:caps w:val="false"/>
+          <w:smallCaps w:val="false"/>
+          <w:color w:val="auto"/>
+          <w:sz w:val="24"/>
+          <w:szCs w:val="24"/>
+          <w:lang w:val="en-GB"/>
+        </w:rPr>
+        <w:t>Chris Leese</w:t>
+      </w:r>
+      <w:r>
+        <w:rPr>
+          <w:rFonts w:eastAsia="Arial" w:cs="Arial"/>
+          <w:b/>
+          <w:bCs/>
+          <w:i w:val="false"/>
+          <w:iCs w:val="false"/>
+          <w:caps w:val="false"/>
+          <w:smallCaps w:val="false"/>
+          <w:color w:val="auto"/>
+          <w:sz w:val="24"/>
+          <w:szCs w:val="24"/>
+          <w:lang w:val="en-GB"/>
+        </w:rPr>
+        <w:t xml:space="preserve"> </w:t>
+      </w:r>
+      <w:r>
+        <w:rPr>
+          <w:rFonts w:eastAsia="Arial" w:cs="Arial"/>
+          <w:b w:val="false"/>
+          <w:bCs w:val="false"/>
+          <w:i w:val="false"/>
+          <w:iCs w:val="false"/>
+          <w:caps w:val="false"/>
+          <w:smallCaps w:val="false"/>
+          <w:color w:val="auto"/>
+          <w:sz w:val="24"/>
+          <w:szCs w:val="24"/>
+          <w:lang w:val="en-GB"/>
+        </w:rPr>
+        <w:t xml:space="preserve">– </w:t>
+      </w:r>
+      <w:r>
+        <w:rPr>
+          <w:rFonts w:eastAsia="Arial" w:cs="Arial"/>
+          <w:b w:val="false"/>
+          <w:bCs w:val="false"/>
+          <w:i w:val="false"/>
+          <w:iCs w:val="false"/>
+          <w:caps w:val="false"/>
+          <w:smallCaps w:val="false"/>
+          <w:color w:val="auto"/>
+          <w:sz w:val="24"/>
+          <w:szCs w:val="24"/>
+          <w:lang w:val="en-GB"/>
+        </w:rPr>
+        <w:t>Broadcast Engineer and Project Coordinator</w:t>
+      </w:r>
+      <w:r>
+        <w:rPr>
+          <w:rFonts w:eastAsia="Arial" w:cs="Arial"/>
+          <w:b w:val="false"/>
+          <w:bCs w:val="false"/>
+          <w:i w:val="false"/>
+          <w:iCs w:val="false"/>
+          <w:caps w:val="false"/>
+          <w:smallCaps w:val="false"/>
+          <w:color w:val="auto"/>
+          <w:sz w:val="24"/>
+          <w:szCs w:val="24"/>
+          <w:lang w:val="en-GB"/>
+        </w:rPr>
+        <w:t xml:space="preserve"> at </w:t>
+      </w:r>
+      <w:r>
+        <w:rPr>
+          <w:rFonts w:eastAsia="Arial" w:cs="Arial"/>
+          <w:b w:val="false"/>
+          <w:bCs w:val="false"/>
+          <w:i w:val="false"/>
+          <w:iCs w:val="false"/>
+          <w:caps w:val="false"/>
+          <w:smallCaps w:val="false"/>
+          <w:color w:val="auto"/>
+          <w:sz w:val="24"/>
+          <w:szCs w:val="24"/>
+          <w:lang w:val="en-GB"/>
+        </w:rPr>
+        <w:t>Vinco Sports</w:t>
+      </w:r>
+      <w:r>
+        <w:rPr>
+          <w:rFonts w:eastAsia="Arial" w:cs="Arial"/>
+          <w:b w:val="false"/>
+          <w:bCs w:val="false"/>
+          <w:i w:val="false"/>
+          <w:iCs w:val="false"/>
+          <w:caps w:val="false"/>
+          <w:smallCaps w:val="false"/>
+          <w:color w:val="auto"/>
+          <w:sz w:val="24"/>
+          <w:szCs w:val="24"/>
+          <w:lang w:val="en-GB"/>
+        </w:rPr>
+        <w:t>.</w:t>
+      </w:r>
+    </w:p>
+    <w:p>
+      <w:pPr>
+        <w:pStyle w:val="Normal"/>
+        <w:suppressLineNumbers w:val="0"/>
+        <w:bidi w:val="0"/>
+        <w:spacing w:lineRule="auto" w:line="259" w:beforeAutospacing="0" w:before="0" w:afterAutospacing="0" w:after="3"/>
+        <w:ind w:hanging="10" w:left="730" w:right="0"/>
+        <w:jc w:val="left"/>
         <w:rPr>
           <w:rFonts w:ascii="Noto Sans" w:hAnsi="Noto Sans" w:eastAsia="Noto Sans" w:cs="Noto Sans"/>
           <w:b w:val="false"/>
           <w:bCs w:val="false"/>
+          <w:i w:val="false"/>
           <w:i w:val="false"/>
           <w:iCs w:val="false"/>
           <w:caps w:val="false"/>
@@ -1990,19 +1960,54 @@
           <w:color w:val="auto"/>
           <w:sz w:val="24"/>
           <w:szCs w:val="24"/>
-          <w:u w:val="single"/>
-          <w:lang w:val="en-GB"/>
-        </w:rPr>
-      </w:r>
-    </w:p>
-    <w:p xmlns:wp14="http://schemas.microsoft.com/office/word/2010/wordml" wp14:textId="77777777">
-      <w:pPr>
-        <w:pStyle w:val="Normal"/>
-        <w:spacing w:before="0" w:after="0" w:afterAutospacing="0" w:line="259" w:lineRule="auto"/>
-        <w:ind w:left="735" w:right="0" w:hanging="0"/>
+          <w:lang w:val="en-GB"/>
+        </w:rPr>
+      </w:pPr>
+      <w:r>
+        <w:rPr>
+          <w:rFonts w:eastAsia="Arial" w:cs="Arial"/>
+          <w:b w:val="false"/>
+          <w:bCs w:val="false"/>
+          <w:i w:val="false"/>
+          <w:iCs w:val="false"/>
+          <w:caps w:val="false"/>
+          <w:smallCaps w:val="false"/>
+          <w:color w:val="auto"/>
+          <w:sz w:val="24"/>
+          <w:szCs w:val="24"/>
+          <w:lang w:val="en-GB"/>
+        </w:rPr>
+        <w:t xml:space="preserve">Email: </w:t>
+      </w:r>
+      <w:hyperlink r:id="rId10">
+        <w:r>
+          <w:rPr>
+            <w:rFonts w:eastAsia="Noto Sans" w:cs="Noto Sans" w:ascii="Noto Sans" w:hAnsi="Noto Sans"/>
+            <w:b w:val="false"/>
+            <w:bCs w:val="false"/>
+            <w:i w:val="false"/>
+            <w:iCs w:val="false"/>
+            <w:caps w:val="false"/>
+            <w:smallCaps w:val="false"/>
+            <w:strike w:val="false"/>
+            <w:dstrike w:val="false"/>
+            <w:color w:val="auto"/>
+            <w:sz w:val="24"/>
+            <w:szCs w:val="24"/>
+            <w:lang w:val="en-GB"/>
+          </w:rPr>
+          <w:t>cleese@vincosport.com</w:t>
+        </w:r>
+      </w:hyperlink>
+    </w:p>
+    <w:p>
+      <w:pPr>
+        <w:pStyle w:val="Normal"/>
+        <w:spacing w:lineRule="auto" w:line="259" w:before="0" w:after="3"/>
+        <w:ind w:hanging="10" w:left="730" w:right="0"/>
         <w:jc w:val="left"/>
         <w:rPr>
-          <w:rFonts w:ascii="Arial" w:hAnsi="Arial" w:eastAsia="Arial" w:cs="Arial"/>
+          <w:rFonts w:ascii="Noto Sans" w:hAnsi="Noto Sans" w:eastAsia="Noto Sans" w:cs="Noto Sans"/>
           <w:b w:val="false"/>
           <w:bCs w:val="false"/>
           <w:i w:val="false"/>
@@ -2015,12 +2020,13 @@
           <w:color w:val="auto"/>
           <w:sz w:val="24"/>
           <w:szCs w:val="24"/>
-          <w:lang w:val="en-GB"/>
-        </w:rPr>
-      </w:pPr>
-      <w:r>
-        <w:rPr>
-          <w:rFonts w:eastAsia="Arial" w:cs="Arial"/>
+          <w:u w:val="single"/>
+          <w:lang w:val="en-GB"/>
+        </w:rPr>
+      </w:pPr>
+      <w:r>
+        <w:rPr>
+          <w:rFonts w:eastAsia="Noto Sans" w:cs="Noto Sans" w:ascii="Noto Sans" w:hAnsi="Noto Sans"/>
           <w:b w:val="false"/>
           <w:bCs w:val="false"/>
           <w:i w:val="false"/>
@@ -2032,15 +2038,16 @@
           <w:color w:val="auto"/>
           <w:sz w:val="24"/>
           <w:szCs w:val="24"/>
-          <w:lang w:val="en-GB"/>
-        </w:rPr>
-      </w:r>
-    </w:p>
-    <w:p xmlns:wp14="http://schemas.microsoft.com/office/word/2010/wordml" wp14:textId="77777777">
-      <w:pPr>
-        <w:pStyle w:val="Normal"/>
-        <w:spacing w:before="0" w:after="0" w:afterAutospacing="0" w:line="259" w:lineRule="auto"/>
-        <w:ind w:left="735" w:right="0" w:hanging="0"/>
+          <w:u w:val="single"/>
+          <w:lang w:val="en-GB"/>
+        </w:rPr>
+      </w:r>
+    </w:p>
+    <w:p>
+      <w:pPr>
+        <w:pStyle w:val="Normal"/>
+        <w:spacing w:lineRule="auto" w:line="259" w:before="0" w:afterAutospacing="0" w:after="0"/>
+        <w:ind w:hanging="0" w:left="735" w:right="0"/>
         <w:jc w:val="left"/>
         <w:rPr>
           <w:rFonts w:ascii="Arial" w:hAnsi="Arial" w:eastAsia="Arial" w:cs="Arial"/>
@@ -2077,11 +2084,52 @@
         </w:rPr>
       </w:r>
     </w:p>
-    <w:p xmlns:wp14="http://schemas.microsoft.com/office/word/2010/wordml" wp14:textId="77777777">
-      <w:pPr>
-        <w:pStyle w:val="Normal"/>
-        <w:spacing w:before="0" w:after="96" w:line="259" w:lineRule="auto"/>
-        <w:ind w:left="3250" w:right="0" w:hanging="370"/>
+    <w:p>
+      <w:pPr>
+        <w:pStyle w:val="Normal"/>
+        <w:spacing w:lineRule="auto" w:line="259" w:before="0" w:afterAutospacing="0" w:after="0"/>
+        <w:ind w:hanging="0" w:left="735" w:right="0"/>
+        <w:jc w:val="left"/>
+        <w:rPr>
+          <w:rFonts w:ascii="Arial" w:hAnsi="Arial" w:eastAsia="Arial" w:cs="Arial"/>
+          <w:b w:val="false"/>
+          <w:bCs w:val="false"/>
+          <w:i w:val="false"/>
+          <w:i w:val="false"/>
+          <w:iCs w:val="false"/>
+          <w:caps w:val="false"/>
+          <w:smallCaps w:val="false"/>
+          <w:strike w:val="false"/>
+          <w:dstrike w:val="false"/>
+          <w:color w:val="auto"/>
+          <w:sz w:val="24"/>
+          <w:szCs w:val="24"/>
+          <w:lang w:val="en-GB"/>
+        </w:rPr>
+      </w:pPr>
+      <w:r>
+        <w:rPr>
+          <w:rFonts w:eastAsia="Arial" w:cs="Arial"/>
+          <w:b w:val="false"/>
+          <w:bCs w:val="false"/>
+          <w:i w:val="false"/>
+          <w:iCs w:val="false"/>
+          <w:caps w:val="false"/>
+          <w:smallCaps w:val="false"/>
+          <w:strike w:val="false"/>
+          <w:dstrike w:val="false"/>
+          <w:color w:val="auto"/>
+          <w:sz w:val="24"/>
+          <w:szCs w:val="24"/>
+          <w:lang w:val="en-GB"/>
+        </w:rPr>
+      </w:r>
+    </w:p>
+    <w:p>
+      <w:pPr>
+        <w:pStyle w:val="Normal"/>
+        <w:spacing w:lineRule="auto" w:line="259" w:before="0" w:after="96"/>
+        <w:ind w:hanging="370" w:left="3250" w:right="0"/>
         <w:rPr/>
       </w:pPr>
       <w:r>
@@ -2090,13 +2138,12 @@
     </w:p>
     <w:sectPr>
       <w:type w:val="nextPage"/>
-      <w:pgSz w:w="11906" w:h="16838" w:orient="portrait"/>
-      <w:pgMar w:top="859" w:right="979" w:bottom="1497" w:left="966" w:header="0" w:footer="0" w:gutter="0"/>
+      <w:pgSz w:w="11906" w:h="16838"/>
+      <w:pgMar w:left="966" w:right="979" w:gutter="0" w:header="0" w:top="859" w:footer="0" w:bottom="1497"/>
       <w:pgNumType w:fmt="decimal"/>
       <w:formProt w:val="false"/>
       <w:textDirection w:val="lrTb"/>
       <w:docGrid w:type="default" w:linePitch="100" w:charSpace="0"/>
-      <w:cols w:num="1"/>
     </w:sectPr>
   </w:body>
 </w:document>
@@ -2117,7 +2164,7 @@
         <w:ind w:left="720" w:hanging="360"/>
       </w:pPr>
       <w:rPr>
-        <w:rFonts w:hint="default" w:ascii="Arial" w:hAnsi="Arial" w:cs="Arial"/>
+        <w:rFonts w:ascii="Arial" w:hAnsi="Arial" w:cs="Arial" w:hint="default"/>
       </w:rPr>
     </w:lvl>
     <w:lvl w:ilvl="1">
@@ -2132,7 +2179,7 @@
         <w:ind w:left="3960" w:hanging="360"/>
       </w:pPr>
       <w:rPr>
-        <w:rFonts w:hint="default" w:ascii="Courier New" w:hAnsi="Courier New" w:cs="Courier New"/>
+        <w:rFonts w:ascii="Courier New" w:hAnsi="Courier New" w:cs="Courier New" w:hint="default"/>
       </w:rPr>
     </w:lvl>
     <w:lvl w:ilvl="2">
@@ -2147,7 +2194,7 @@
         <w:ind w:left="4680" w:hanging="360"/>
       </w:pPr>
       <w:rPr>
-        <w:rFonts w:hint="default" w:ascii="Wingdings" w:hAnsi="Wingdings" w:cs="Wingdings"/>
+        <w:rFonts w:ascii="Wingdings" w:hAnsi="Wingdings" w:cs="Wingdings" w:hint="default"/>
       </w:rPr>
     </w:lvl>
     <w:lvl w:ilvl="3">
@@ -2162,7 +2209,7 @@
         <w:ind w:left="5400" w:hanging="360"/>
       </w:pPr>
       <w:rPr>
-        <w:rFonts w:hint="default" w:ascii="Symbol" w:hAnsi="Symbol" w:cs="Symbol"/>
+        <w:rFonts w:ascii="Symbol" w:hAnsi="Symbol" w:cs="Symbol" w:hint="default"/>
       </w:rPr>
     </w:lvl>
     <w:lvl w:ilvl="4">
@@ -2177,7 +2224,7 @@
         <w:ind w:left="6120" w:hanging="360"/>
       </w:pPr>
       <w:rPr>
-        <w:rFonts w:hint="default" w:ascii="Courier New" w:hAnsi="Courier New" w:cs="Courier New"/>
+        <w:rFonts w:ascii="Courier New" w:hAnsi="Courier New" w:cs="Courier New" w:hint="default"/>
       </w:rPr>
     </w:lvl>
     <w:lvl w:ilvl="5">
@@ -2192,7 +2239,7 @@
         <w:ind w:left="6840" w:hanging="360"/>
       </w:pPr>
       <w:rPr>
-        <w:rFonts w:hint="default" w:ascii="Wingdings" w:hAnsi="Wingdings" w:cs="Wingdings"/>
+        <w:rFonts w:ascii="Wingdings" w:hAnsi="Wingdings" w:cs="Wingdings" w:hint="default"/>
       </w:rPr>
     </w:lvl>
     <w:lvl w:ilvl="6">
@@ -2207,7 +2254,7 @@
         <w:ind w:left="7560" w:hanging="360"/>
       </w:pPr>
       <w:rPr>
-        <w:rFonts w:hint="default" w:ascii="Symbol" w:hAnsi="Symbol" w:cs="Symbol"/>
+        <w:rFonts w:ascii="Symbol" w:hAnsi="Symbol" w:cs="Symbol" w:hint="default"/>
       </w:rPr>
     </w:lvl>
     <w:lvl w:ilvl="7">
@@ -2222,7 +2269,7 @@
         <w:ind w:left="8280" w:hanging="360"/>
       </w:pPr>
       <w:rPr>
-        <w:rFonts w:hint="default" w:ascii="Courier New" w:hAnsi="Courier New" w:cs="Courier New"/>
+        <w:rFonts w:ascii="Courier New" w:hAnsi="Courier New" w:cs="Courier New" w:hint="default"/>
       </w:rPr>
     </w:lvl>
     <w:lvl w:ilvl="8">
@@ -2237,10 +2284,9 @@
         <w:ind w:left="9000" w:hanging="360"/>
       </w:pPr>
       <w:rPr>
-        <w:rFonts w:hint="default" w:ascii="Wingdings" w:hAnsi="Wingdings" w:cs="Wingdings"/>
-      </w:rPr>
-    </w:lvl>
-    <w:nsid w:val="2bc15225"/>
+        <w:rFonts w:ascii="Wingdings" w:hAnsi="Wingdings" w:cs="Wingdings" w:hint="default"/>
+      </w:rPr>
+    </w:lvl>
   </w:abstractNum>
   <w:abstractNum w:abstractNumId="2">
     <w:lvl w:ilvl="0">
@@ -2255,7 +2301,7 @@
         <w:ind w:left="705" w:hanging="0"/>
       </w:pPr>
       <w:rPr>
-        <w:rFonts w:hint="default" w:ascii="Arial" w:hAnsi="Arial" w:cs="Arial"/>
+        <w:rFonts w:ascii="Arial" w:hAnsi="Arial" w:cs="Arial" w:hint="default"/>
         <w:dstrike w:val="false"/>
         <w:strike w:val="false"/>
         <w:vertAlign w:val="baseline"/>
@@ -2265,7 +2311,7 @@
         <w:i w:val="false"/>
         <w:u w:val="none" w:color="000000"/>
         <w:b w:val="false"/>
-        <w:shd w:val="clear" w:fill="auto"/>
+        <w:shd w:fill="auto" w:val="clear"/>
         <w:szCs w:val="24"/>
         <w:color w:val="000000"/>
       </w:rPr>
@@ -2282,7 +2328,7 @@
         <w:ind w:left="1440" w:hanging="0"/>
       </w:pPr>
       <w:rPr>
-        <w:rFonts w:hint="default" w:ascii="Calibri" w:hAnsi="Calibri" w:cs="Calibri"/>
+        <w:rFonts w:ascii="Calibri" w:hAnsi="Calibri" w:cs="Calibri" w:hint="default"/>
         <w:dstrike w:val="false"/>
         <w:strike w:val="false"/>
         <w:vertAlign w:val="baseline"/>
@@ -2292,7 +2338,7 @@
         <w:i w:val="false"/>
         <w:u w:val="none" w:color="000000"/>
         <w:b w:val="false"/>
-        <w:shd w:val="clear" w:fill="auto"/>
+        <w:shd w:fill="auto" w:val="clear"/>
         <w:szCs w:val="24"/>
         <w:color w:val="000000"/>
       </w:rPr>
@@ -2309,7 +2355,7 @@
         <w:ind w:left="2160" w:hanging="0"/>
       </w:pPr>
       <w:rPr>
-        <w:rFonts w:hint="default" w:ascii="Calibri" w:hAnsi="Calibri" w:cs="Calibri"/>
+        <w:rFonts w:ascii="Calibri" w:hAnsi="Calibri" w:cs="Calibri" w:hint="default"/>
         <w:dstrike w:val="false"/>
         <w:strike w:val="false"/>
         <w:vertAlign w:val="baseline"/>
@@ -2319,7 +2365,7 @@
         <w:i w:val="false"/>
         <w:u w:val="none" w:color="000000"/>
         <w:b w:val="false"/>
-        <w:shd w:val="clear" w:fill="auto"/>
+        <w:shd w:fill="auto" w:val="clear"/>
         <w:szCs w:val="24"/>
         <w:color w:val="000000"/>
       </w:rPr>
@@ -2336,7 +2382,7 @@
         <w:ind w:left="2880" w:hanging="0"/>
       </w:pPr>
       <w:rPr>
-        <w:rFonts w:hint="default" w:ascii="Calibri" w:hAnsi="Calibri" w:cs="Calibri"/>
+        <w:rFonts w:ascii="Calibri" w:hAnsi="Calibri" w:cs="Calibri" w:hint="default"/>
         <w:dstrike w:val="false"/>
         <w:strike w:val="false"/>
         <w:vertAlign w:val="baseline"/>
@@ -2346,7 +2392,7 @@
         <w:i w:val="false"/>
         <w:u w:val="none" w:color="000000"/>
         <w:b w:val="false"/>
-        <w:shd w:val="clear" w:fill="auto"/>
+        <w:shd w:fill="auto" w:val="clear"/>
         <w:szCs w:val="24"/>
         <w:color w:val="000000"/>
       </w:rPr>
@@ -2363,7 +2409,7 @@
         <w:ind w:left="3600" w:hanging="0"/>
       </w:pPr>
       <w:rPr>
-        <w:rFonts w:hint="default" w:ascii="Calibri" w:hAnsi="Calibri" w:cs="Calibri"/>
+        <w:rFonts w:ascii="Calibri" w:hAnsi="Calibri" w:cs="Calibri" w:hint="default"/>
         <w:dstrike w:val="false"/>
         <w:strike w:val="false"/>
         <w:vertAlign w:val="baseline"/>
@@ -2373,7 +2419,7 @@
         <w:i w:val="false"/>
         <w:u w:val="none" w:color="000000"/>
         <w:b w:val="false"/>
-        <w:shd w:val="clear" w:fill="auto"/>
+        <w:shd w:fill="auto" w:val="clear"/>
         <w:szCs w:val="24"/>
         <w:color w:val="000000"/>
       </w:rPr>
@@ -2390,7 +2436,7 @@
         <w:ind w:left="4320" w:hanging="0"/>
       </w:pPr>
       <w:rPr>
-        <w:rFonts w:hint="default" w:ascii="Calibri" w:hAnsi="Calibri" w:cs="Calibri"/>
+        <w:rFonts w:ascii="Calibri" w:hAnsi="Calibri" w:cs="Calibri" w:hint="default"/>
         <w:dstrike w:val="false"/>
         <w:strike w:val="false"/>
         <w:vertAlign w:val="baseline"/>
@@ -2400,7 +2446,7 @@
         <w:i w:val="false"/>
         <w:u w:val="none" w:color="000000"/>
         <w:b w:val="false"/>
-        <w:shd w:val="clear" w:fill="auto"/>
+        <w:shd w:fill="auto" w:val="clear"/>
         <w:szCs w:val="24"/>
         <w:color w:val="000000"/>
       </w:rPr>
@@ -2417,7 +2463,7 @@
         <w:ind w:left="5040" w:hanging="0"/>
       </w:pPr>
       <w:rPr>
-        <w:rFonts w:hint="default" w:ascii="Calibri" w:hAnsi="Calibri" w:cs="Calibri"/>
+        <w:rFonts w:ascii="Calibri" w:hAnsi="Calibri" w:cs="Calibri" w:hint="default"/>
         <w:dstrike w:val="false"/>
         <w:strike w:val="false"/>
         <w:vertAlign w:val="baseline"/>
@@ -2427,7 +2473,7 @@
         <w:i w:val="false"/>
         <w:u w:val="none" w:color="000000"/>
         <w:b w:val="false"/>
-        <w:shd w:val="clear" w:fill="auto"/>
+        <w:shd w:fill="auto" w:val="clear"/>
         <w:szCs w:val="24"/>
         <w:color w:val="000000"/>
       </w:rPr>
@@ -2444,7 +2490,7 @@
         <w:ind w:left="5760" w:hanging="0"/>
       </w:pPr>
       <w:rPr>
-        <w:rFonts w:hint="default" w:ascii="Calibri" w:hAnsi="Calibri" w:cs="Calibri"/>
+        <w:rFonts w:ascii="Calibri" w:hAnsi="Calibri" w:cs="Calibri" w:hint="default"/>
         <w:dstrike w:val="false"/>
         <w:strike w:val="false"/>
         <w:vertAlign w:val="baseline"/>
@@ -2454,7 +2500,7 @@
         <w:i w:val="false"/>
         <w:u w:val="none" w:color="000000"/>
         <w:b w:val="false"/>
-        <w:shd w:val="clear" w:fill="auto"/>
+        <w:shd w:fill="auto" w:val="clear"/>
         <w:szCs w:val="24"/>
         <w:color w:val="000000"/>
       </w:rPr>
@@ -2471,7 +2517,7 @@
         <w:ind w:left="6480" w:hanging="0"/>
       </w:pPr>
       <w:rPr>
-        <w:rFonts w:hint="default" w:ascii="Calibri" w:hAnsi="Calibri" w:cs="Calibri"/>
+        <w:rFonts w:ascii="Calibri" w:hAnsi="Calibri" w:cs="Calibri" w:hint="default"/>
         <w:dstrike w:val="false"/>
         <w:strike w:val="false"/>
         <w:vertAlign w:val="baseline"/>
@@ -2481,12 +2527,11 @@
         <w:i w:val="false"/>
         <w:u w:val="none" w:color="000000"/>
         <w:b w:val="false"/>
-        <w:shd w:val="clear" w:fill="auto"/>
+        <w:shd w:fill="auto" w:val="clear"/>
         <w:szCs w:val="24"/>
         <w:color w:val="000000"/>
       </w:rPr>
     </w:lvl>
-    <w:nsid w:val="6937e314"/>
   </w:abstractNum>
   <w:abstractNum w:abstractNumId="3">
     <w:lvl w:ilvl="0">
@@ -2501,7 +2546,7 @@
         <w:ind w:left="705" w:hanging="0"/>
       </w:pPr>
       <w:rPr>
-        <w:rFonts w:hint="default" w:ascii="Arial" w:hAnsi="Arial" w:cs="Arial"/>
+        <w:rFonts w:ascii="Arial" w:hAnsi="Arial" w:cs="Arial" w:hint="default"/>
         <w:dstrike w:val="false"/>
         <w:strike w:val="false"/>
         <w:vertAlign w:val="baseline"/>
@@ -2511,7 +2556,7 @@
         <w:i w:val="false"/>
         <w:u w:val="none" w:color="000000"/>
         <w:b w:val="false"/>
-        <w:shd w:val="clear" w:fill="auto"/>
+        <w:shd w:fill="auto" w:val="clear"/>
         <w:szCs w:val="24"/>
         <w:color w:val="000000"/>
       </w:rPr>
@@ -2528,7 +2573,7 @@
         <w:ind w:left="1440" w:hanging="0"/>
       </w:pPr>
       <w:rPr>
-        <w:rFonts w:hint="default" w:ascii="Calibri" w:hAnsi="Calibri" w:cs="Calibri"/>
+        <w:rFonts w:ascii="Calibri" w:hAnsi="Calibri" w:cs="Calibri" w:hint="default"/>
         <w:dstrike w:val="false"/>
         <w:strike w:val="false"/>
         <w:vertAlign w:val="baseline"/>
@@ -2538,7 +2583,7 @@
         <w:i w:val="false"/>
         <w:u w:val="none" w:color="000000"/>
         <w:b w:val="false"/>
-        <w:shd w:val="clear" w:fill="auto"/>
+        <w:shd w:fill="auto" w:val="clear"/>
         <w:szCs w:val="24"/>
         <w:color w:val="000000"/>
       </w:rPr>
@@ -2555,7 +2600,7 @@
         <w:ind w:left="2160" w:hanging="0"/>
       </w:pPr>
       <w:rPr>
-        <w:rFonts w:hint="default" w:ascii="Calibri" w:hAnsi="Calibri" w:cs="Calibri"/>
+        <w:rFonts w:ascii="Calibri" w:hAnsi="Calibri" w:cs="Calibri" w:hint="default"/>
         <w:dstrike w:val="false"/>
         <w:strike w:val="false"/>
         <w:vertAlign w:val="baseline"/>
@@ -2565,7 +2610,7 @@
         <w:i w:val="false"/>
         <w:u w:val="none" w:color="000000"/>
         <w:b w:val="false"/>
-        <w:shd w:val="clear" w:fill="auto"/>
+        <w:shd w:fill="auto" w:val="clear"/>
         <w:szCs w:val="24"/>
         <w:color w:val="000000"/>
       </w:rPr>
@@ -2582,7 +2627,7 @@
         <w:ind w:left="2880" w:hanging="0"/>
       </w:pPr>
       <w:rPr>
-        <w:rFonts w:hint="default" w:ascii="Calibri" w:hAnsi="Calibri" w:cs="Calibri"/>
+        <w:rFonts w:ascii="Calibri" w:hAnsi="Calibri" w:cs="Calibri" w:hint="default"/>
         <w:dstrike w:val="false"/>
         <w:strike w:val="false"/>
         <w:vertAlign w:val="baseline"/>
@@ -2592,7 +2637,7 @@
         <w:i w:val="false"/>
         <w:u w:val="none" w:color="000000"/>
         <w:b w:val="false"/>
-        <w:shd w:val="clear" w:fill="auto"/>
+        <w:shd w:fill="auto" w:val="clear"/>
         <w:szCs w:val="24"/>
         <w:color w:val="000000"/>
       </w:rPr>
@@ -2609,7 +2654,7 @@
         <w:ind w:left="3600" w:hanging="0"/>
       </w:pPr>
       <w:rPr>
-        <w:rFonts w:hint="default" w:ascii="Calibri" w:hAnsi="Calibri" w:cs="Calibri"/>
+        <w:rFonts w:ascii="Calibri" w:hAnsi="Calibri" w:cs="Calibri" w:hint="default"/>
         <w:dstrike w:val="false"/>
         <w:strike w:val="false"/>
         <w:vertAlign w:val="baseline"/>
@@ -2619,7 +2664,7 @@
         <w:i w:val="false"/>
         <w:u w:val="none" w:color="000000"/>
         <w:b w:val="false"/>
-        <w:shd w:val="clear" w:fill="auto"/>
+        <w:shd w:fill="auto" w:val="clear"/>
         <w:szCs w:val="24"/>
         <w:color w:val="000000"/>
       </w:rPr>
@@ -2636,7 +2681,7 @@
         <w:ind w:left="4320" w:hanging="0"/>
       </w:pPr>
       <w:rPr>
-        <w:rFonts w:hint="default" w:ascii="Calibri" w:hAnsi="Calibri" w:cs="Calibri"/>
+        <w:rFonts w:ascii="Calibri" w:hAnsi="Calibri" w:cs="Calibri" w:hint="default"/>
         <w:dstrike w:val="false"/>
         <w:strike w:val="false"/>
         <w:vertAlign w:val="baseline"/>
@@ -2646,7 +2691,7 @@
         <w:i w:val="false"/>
         <w:u w:val="none" w:color="000000"/>
         <w:b w:val="false"/>
-        <w:shd w:val="clear" w:fill="auto"/>
+        <w:shd w:fill="auto" w:val="clear"/>
         <w:szCs w:val="24"/>
         <w:color w:val="000000"/>
       </w:rPr>
@@ -2663,7 +2708,7 @@
         <w:ind w:left="5040" w:hanging="0"/>
       </w:pPr>
       <w:rPr>
-        <w:rFonts w:hint="default" w:ascii="Calibri" w:hAnsi="Calibri" w:cs="Calibri"/>
+        <w:rFonts w:ascii="Calibri" w:hAnsi="Calibri" w:cs="Calibri" w:hint="default"/>
         <w:dstrike w:val="false"/>
         <w:strike w:val="false"/>
         <w:vertAlign w:val="baseline"/>
@@ -2673,7 +2718,7 @@
         <w:i w:val="false"/>
         <w:u w:val="none" w:color="000000"/>
         <w:b w:val="false"/>
-        <w:shd w:val="clear" w:fill="auto"/>
+        <w:shd w:fill="auto" w:val="clear"/>
         <w:szCs w:val="24"/>
         <w:color w:val="000000"/>
       </w:rPr>
@@ -2690,7 +2735,7 @@
         <w:ind w:left="5760" w:hanging="0"/>
       </w:pPr>
       <w:rPr>
-        <w:rFonts w:hint="default" w:ascii="Calibri" w:hAnsi="Calibri" w:cs="Calibri"/>
+        <w:rFonts w:ascii="Calibri" w:hAnsi="Calibri" w:cs="Calibri" w:hint="default"/>
         <w:dstrike w:val="false"/>
         <w:strike w:val="false"/>
         <w:vertAlign w:val="baseline"/>
@@ -2700,7 +2745,7 @@
         <w:i w:val="false"/>
         <w:u w:val="none" w:color="000000"/>
         <w:b w:val="false"/>
-        <w:shd w:val="clear" w:fill="auto"/>
+        <w:shd w:fill="auto" w:val="clear"/>
         <w:szCs w:val="24"/>
         <w:color w:val="000000"/>
       </w:rPr>
@@ -2717,7 +2762,7 @@
         <w:ind w:left="6480" w:hanging="0"/>
       </w:pPr>
       <w:rPr>
-        <w:rFonts w:hint="default" w:ascii="Calibri" w:hAnsi="Calibri" w:cs="Calibri"/>
+        <w:rFonts w:ascii="Calibri" w:hAnsi="Calibri" w:cs="Calibri" w:hint="default"/>
         <w:dstrike w:val="false"/>
         <w:strike w:val="false"/>
         <w:vertAlign w:val="baseline"/>
@@ -2727,12 +2772,11 @@
         <w:i w:val="false"/>
         <w:u w:val="none" w:color="000000"/>
         <w:b w:val="false"/>
-        <w:shd w:val="clear" w:fill="auto"/>
+        <w:shd w:fill="auto" w:val="clear"/>
         <w:szCs w:val="24"/>
         <w:color w:val="000000"/>
       </w:rPr>
     </w:lvl>
-    <w:nsid w:val="732b61c1"/>
   </w:abstractNum>
   <w:abstractNum w:abstractNumId="4">
     <w:lvl w:ilvl="0">
@@ -2747,7 +2791,7 @@
         <w:ind w:left="705" w:hanging="0"/>
       </w:pPr>
       <w:rPr>
-        <w:rFonts w:hint="default" w:ascii="Arial" w:hAnsi="Arial" w:cs="Arial"/>
+        <w:rFonts w:ascii="Arial" w:hAnsi="Arial" w:cs="Arial" w:hint="default"/>
         <w:dstrike w:val="false"/>
         <w:strike w:val="false"/>
         <w:vertAlign w:val="baseline"/>
@@ -2757,7 +2801,7 @@
         <w:i w:val="false"/>
         <w:u w:val="none" w:color="000000"/>
         <w:b w:val="false"/>
-        <w:shd w:val="clear" w:fill="auto"/>
+        <w:shd w:fill="auto" w:val="clear"/>
         <w:szCs w:val="24"/>
         <w:color w:val="000000"/>
       </w:rPr>
@@ -2774,7 +2818,7 @@
         <w:ind w:left="1440" w:hanging="0"/>
       </w:pPr>
       <w:rPr>
-        <w:rFonts w:hint="default" w:ascii="Calibri" w:hAnsi="Calibri" w:cs="Calibri"/>
+        <w:rFonts w:ascii="Calibri" w:hAnsi="Calibri" w:cs="Calibri" w:hint="default"/>
         <w:dstrike w:val="false"/>
         <w:strike w:val="false"/>
         <w:vertAlign w:val="baseline"/>
@@ -2784,7 +2828,7 @@
         <w:i w:val="false"/>
         <w:u w:val="none" w:color="000000"/>
         <w:b w:val="false"/>
-        <w:shd w:val="clear" w:fill="auto"/>
+        <w:shd w:fill="auto" w:val="clear"/>
         <w:szCs w:val="24"/>
         <w:color w:val="000000"/>
       </w:rPr>
@@ -2801,7 +2845,7 @@
         <w:ind w:left="2160" w:hanging="0"/>
       </w:pPr>
       <w:rPr>
-        <w:rFonts w:hint="default" w:ascii="Calibri" w:hAnsi="Calibri" w:cs="Calibri"/>
+        <w:rFonts w:ascii="Calibri" w:hAnsi="Calibri" w:cs="Calibri" w:hint="default"/>
         <w:dstrike w:val="false"/>
         <w:strike w:val="false"/>
         <w:vertAlign w:val="baseline"/>
@@ -2811,7 +2855,7 @@
         <w:i w:val="false"/>
         <w:u w:val="none" w:color="000000"/>
         <w:b w:val="false"/>
-        <w:shd w:val="clear" w:fill="auto"/>
+        <w:shd w:fill="auto" w:val="clear"/>
         <w:szCs w:val="24"/>
         <w:color w:val="000000"/>
       </w:rPr>
@@ -2828,7 +2872,7 @@
         <w:ind w:left="2880" w:hanging="0"/>
       </w:pPr>
       <w:rPr>
-        <w:rFonts w:hint="default" w:ascii="Calibri" w:hAnsi="Calibri" w:cs="Calibri"/>
+        <w:rFonts w:ascii="Calibri" w:hAnsi="Calibri" w:cs="Calibri" w:hint="default"/>
         <w:dstrike w:val="false"/>
         <w:strike w:val="false"/>
         <w:vertAlign w:val="baseline"/>
@@ -2838,7 +2882,7 @@
         <w:i w:val="false"/>
         <w:u w:val="none" w:color="000000"/>
         <w:b w:val="false"/>
-        <w:shd w:val="clear" w:fill="auto"/>
+        <w:shd w:fill="auto" w:val="clear"/>
         <w:szCs w:val="24"/>
         <w:color w:val="000000"/>
       </w:rPr>
@@ -2855,7 +2899,7 @@
         <w:ind w:left="3600" w:hanging="0"/>
       </w:pPr>
       <w:rPr>
-        <w:rFonts w:hint="default" w:ascii="Calibri" w:hAnsi="Calibri" w:cs="Calibri"/>
+        <w:rFonts w:ascii="Calibri" w:hAnsi="Calibri" w:cs="Calibri" w:hint="default"/>
         <w:dstrike w:val="false"/>
         <w:strike w:val="false"/>
         <w:vertAlign w:val="baseline"/>
@@ -2865,7 +2909,7 @@
         <w:i w:val="false"/>
         <w:u w:val="none" w:color="000000"/>
         <w:b w:val="false"/>
-        <w:shd w:val="clear" w:fill="auto"/>
+        <w:shd w:fill="auto" w:val="clear"/>
         <w:szCs w:val="24"/>
         <w:color w:val="000000"/>
       </w:rPr>
@@ -2882,7 +2926,7 @@
         <w:ind w:left="4320" w:hanging="0"/>
       </w:pPr>
       <w:rPr>
-        <w:rFonts w:hint="default" w:ascii="Calibri" w:hAnsi="Calibri" w:cs="Calibri"/>
+        <w:rFonts w:ascii="Calibri" w:hAnsi="Calibri" w:cs="Calibri" w:hint="default"/>
         <w:dstrike w:val="false"/>
         <w:strike w:val="false"/>
         <w:vertAlign w:val="baseline"/>
@@ -2892,7 +2936,7 @@
         <w:i w:val="false"/>
         <w:u w:val="none" w:color="000000"/>
         <w:b w:val="false"/>
-        <w:shd w:val="clear" w:fill="auto"/>
+        <w:shd w:fill="auto" w:val="clear"/>
         <w:szCs w:val="24"/>
         <w:color w:val="000000"/>
       </w:rPr>
@@ -2909,7 +2953,7 @@
         <w:ind w:left="5040" w:hanging="0"/>
       </w:pPr>
       <w:rPr>
-        <w:rFonts w:hint="default" w:ascii="Calibri" w:hAnsi="Calibri" w:cs="Calibri"/>
+        <w:rFonts w:ascii="Calibri" w:hAnsi="Calibri" w:cs="Calibri" w:hint="default"/>
         <w:dstrike w:val="false"/>
         <w:strike w:val="false"/>
         <w:vertAlign w:val="baseline"/>
@@ -2919,7 +2963,7 @@
         <w:i w:val="false"/>
         <w:u w:val="none" w:color="000000"/>
         <w:b w:val="false"/>
-        <w:shd w:val="clear" w:fill="auto"/>
+        <w:shd w:fill="auto" w:val="clear"/>
         <w:szCs w:val="24"/>
         <w:color w:val="000000"/>
       </w:rPr>
@@ -2936,7 +2980,7 @@
         <w:ind w:left="5760" w:hanging="0"/>
       </w:pPr>
       <w:rPr>
-        <w:rFonts w:hint="default" w:ascii="Calibri" w:hAnsi="Calibri" w:cs="Calibri"/>
+        <w:rFonts w:ascii="Calibri" w:hAnsi="Calibri" w:cs="Calibri" w:hint="default"/>
         <w:dstrike w:val="false"/>
         <w:strike w:val="false"/>
         <w:vertAlign w:val="baseline"/>
@@ -2946,7 +2990,7 @@
         <w:i w:val="false"/>
         <w:u w:val="none" w:color="000000"/>
         <w:b w:val="false"/>
-        <w:shd w:val="clear" w:fill="auto"/>
+        <w:shd w:fill="auto" w:val="clear"/>
         <w:szCs w:val="24"/>
         <w:color w:val="000000"/>
       </w:rPr>
@@ -2963,7 +3007,7 @@
         <w:ind w:left="6480" w:hanging="0"/>
       </w:pPr>
       <w:rPr>
-        <w:rFonts w:hint="default" w:ascii="Calibri" w:hAnsi="Calibri" w:cs="Calibri"/>
+        <w:rFonts w:ascii="Calibri" w:hAnsi="Calibri" w:cs="Calibri" w:hint="default"/>
         <w:dstrike w:val="false"/>
         <w:strike w:val="false"/>
         <w:vertAlign w:val="baseline"/>
@@ -2973,12 +3017,11 @@
         <w:i w:val="false"/>
         <w:u w:val="none" w:color="000000"/>
         <w:b w:val="false"/>
-        <w:shd w:val="clear" w:fill="auto"/>
+        <w:shd w:fill="auto" w:val="clear"/>
         <w:szCs w:val="24"/>
         <w:color w:val="000000"/>
       </w:rPr>
     </w:lvl>
-    <w:nsid w:val="13893967"/>
   </w:abstractNum>
   <w:abstractNum w:abstractNumId="5">
     <w:lvl w:ilvl="0">
@@ -2993,7 +3036,7 @@
         <w:ind w:left="705" w:hanging="0"/>
       </w:pPr>
       <w:rPr>
-        <w:rFonts w:hint="default" w:ascii="Arial" w:hAnsi="Arial" w:cs="Arial"/>
+        <w:rFonts w:ascii="Arial" w:hAnsi="Arial" w:cs="Arial" w:hint="default"/>
         <w:dstrike w:val="false"/>
         <w:strike w:val="false"/>
         <w:vertAlign w:val="baseline"/>
@@ -3003,7 +3046,7 @@
         <w:i w:val="false"/>
         <w:u w:val="none" w:color="000000"/>
         <w:b w:val="false"/>
-        <w:shd w:val="clear" w:fill="auto"/>
+        <w:shd w:fill="auto" w:val="clear"/>
         <w:szCs w:val="24"/>
         <w:color w:val="000000"/>
       </w:rPr>
@@ -3020,7 +3063,7 @@
         <w:ind w:left="1440" w:hanging="0"/>
       </w:pPr>
       <w:rPr>
-        <w:rFonts w:hint="default" w:ascii="Calibri" w:hAnsi="Calibri" w:cs="Calibri"/>
+        <w:rFonts w:ascii="Calibri" w:hAnsi="Calibri" w:cs="Calibri" w:hint="default"/>
         <w:dstrike w:val="false"/>
         <w:strike w:val="false"/>
         <w:vertAlign w:val="baseline"/>
@@ -3030,7 +3073,7 @@
         <w:i w:val="false"/>
         <w:u w:val="none" w:color="000000"/>
         <w:b w:val="false"/>
-        <w:shd w:val="clear" w:fill="auto"/>
+        <w:shd w:fill="auto" w:val="clear"/>
         <w:szCs w:val="24"/>
         <w:color w:val="000000"/>
       </w:rPr>
@@ -3047,7 +3090,7 @@
         <w:ind w:left="2160" w:hanging="0"/>
       </w:pPr>
       <w:rPr>
-        <w:rFonts w:hint="default" w:ascii="Calibri" w:hAnsi="Calibri" w:cs="Calibri"/>
+        <w:rFonts w:ascii="Calibri" w:hAnsi="Calibri" w:cs="Calibri" w:hint="default"/>
         <w:dstrike w:val="false"/>
         <w:strike w:val="false"/>
         <w:vertAlign w:val="baseline"/>
@@ -3057,7 +3100,7 @@
         <w:i w:val="false"/>
         <w:u w:val="none" w:color="000000"/>
         <w:b w:val="false"/>
-        <w:shd w:val="clear" w:fill="auto"/>
+        <w:shd w:fill="auto" w:val="clear"/>
         <w:szCs w:val="24"/>
         <w:color w:val="000000"/>
       </w:rPr>
@@ -3074,7 +3117,7 @@
         <w:ind w:left="2880" w:hanging="0"/>
       </w:pPr>
       <w:rPr>
-        <w:rFonts w:hint="default" w:ascii="Calibri" w:hAnsi="Calibri" w:cs="Calibri"/>
+        <w:rFonts w:ascii="Calibri" w:hAnsi="Calibri" w:cs="Calibri" w:hint="default"/>
         <w:dstrike w:val="false"/>
         <w:strike w:val="false"/>
         <w:vertAlign w:val="baseline"/>
@@ -3084,7 +3127,7 @@
         <w:i w:val="false"/>
         <w:u w:val="none" w:color="000000"/>
         <w:b w:val="false"/>
-        <w:shd w:val="clear" w:fill="auto"/>
+        <w:shd w:fill="auto" w:val="clear"/>
         <w:szCs w:val="24"/>
         <w:color w:val="000000"/>
       </w:rPr>
@@ -3101,7 +3144,7 @@
         <w:ind w:left="3600" w:hanging="0"/>
       </w:pPr>
       <w:rPr>
-        <w:rFonts w:hint="default" w:ascii="Calibri" w:hAnsi="Calibri" w:cs="Calibri"/>
+        <w:rFonts w:ascii="Calibri" w:hAnsi="Calibri" w:cs="Calibri" w:hint="default"/>
         <w:dstrike w:val="false"/>
         <w:strike w:val="false"/>
         <w:vertAlign w:val="baseline"/>
@@ -3111,7 +3154,7 @@
         <w:i w:val="false"/>
         <w:u w:val="none" w:color="000000"/>
         <w:b w:val="false"/>
-        <w:shd w:val="clear" w:fill="auto"/>
+        <w:shd w:fill="auto" w:val="clear"/>
         <w:szCs w:val="24"/>
         <w:color w:val="000000"/>
       </w:rPr>
@@ -3128,7 +3171,7 @@
         <w:ind w:left="4320" w:hanging="0"/>
       </w:pPr>
       <w:rPr>
-        <w:rFonts w:hint="default" w:ascii="Calibri" w:hAnsi="Calibri" w:cs="Calibri"/>
+        <w:rFonts w:ascii="Calibri" w:hAnsi="Calibri" w:cs="Calibri" w:hint="default"/>
         <w:dstrike w:val="false"/>
         <w:strike w:val="false"/>
         <w:vertAlign w:val="baseline"/>
@@ -3138,7 +3181,7 @@
         <w:i w:val="false"/>
         <w:u w:val="none" w:color="000000"/>
         <w:b w:val="false"/>
-        <w:shd w:val="clear" w:fill="auto"/>
+        <w:shd w:fill="auto" w:val="clear"/>
         <w:szCs w:val="24"/>
         <w:color w:val="000000"/>
       </w:rPr>
@@ -3155,7 +3198,7 @@
         <w:ind w:left="5040" w:hanging="0"/>
       </w:pPr>
       <w:rPr>
-        <w:rFonts w:hint="default" w:ascii="Calibri" w:hAnsi="Calibri" w:cs="Calibri"/>
+        <w:rFonts w:ascii="Calibri" w:hAnsi="Calibri" w:cs="Calibri" w:hint="default"/>
         <w:dstrike w:val="false"/>
         <w:strike w:val="false"/>
         <w:vertAlign w:val="baseline"/>
@@ -3165,7 +3208,7 @@
         <w:i w:val="false"/>
         <w:u w:val="none" w:color="000000"/>
         <w:b w:val="false"/>
-        <w:shd w:val="clear" w:fill="auto"/>
+        <w:shd w:fill="auto" w:val="clear"/>
         <w:szCs w:val="24"/>
         <w:color w:val="000000"/>
       </w:rPr>
@@ -3182,7 +3225,7 @@
         <w:ind w:left="5760" w:hanging="0"/>
       </w:pPr>
       <w:rPr>
-        <w:rFonts w:hint="default" w:ascii="Calibri" w:hAnsi="Calibri" w:cs="Calibri"/>
+        <w:rFonts w:ascii="Calibri" w:hAnsi="Calibri" w:cs="Calibri" w:hint="default"/>
         <w:dstrike w:val="false"/>
         <w:strike w:val="false"/>
         <w:vertAlign w:val="baseline"/>
@@ -3192,7 +3235,7 @@
         <w:i w:val="false"/>
         <w:u w:val="none" w:color="000000"/>
         <w:b w:val="false"/>
-        <w:shd w:val="clear" w:fill="auto"/>
+        <w:shd w:fill="auto" w:val="clear"/>
         <w:szCs w:val="24"/>
         <w:color w:val="000000"/>
       </w:rPr>
@@ -3209,7 +3252,7 @@
         <w:ind w:left="6480" w:hanging="0"/>
       </w:pPr>
       <w:rPr>
-        <w:rFonts w:hint="default" w:ascii="Calibri" w:hAnsi="Calibri" w:cs="Calibri"/>
+        <w:rFonts w:ascii="Calibri" w:hAnsi="Calibri" w:cs="Calibri" w:hint="default"/>
         <w:dstrike w:val="false"/>
         <w:strike w:val="false"/>
         <w:vertAlign w:val="baseline"/>
@@ -3219,12 +3262,11 @@
         <w:i w:val="false"/>
         <w:u w:val="none" w:color="000000"/>
         <w:b w:val="false"/>
-        <w:shd w:val="clear" w:fill="auto"/>
+        <w:shd w:fill="auto" w:val="clear"/>
         <w:szCs w:val="24"/>
         <w:color w:val="000000"/>
       </w:rPr>
     </w:lvl>
-    <w:nsid w:val="4c939d85"/>
   </w:abstractNum>
   <w:abstractNum w:abstractNumId="6">
     <w:lvl w:ilvl="0">
@@ -3239,7 +3281,7 @@
         <w:ind w:left="720" w:hanging="360"/>
       </w:pPr>
       <w:rPr>
-        <w:rFonts w:hint="default" w:ascii="Symbol" w:hAnsi="Symbol" w:cs="Symbol"/>
+        <w:rFonts w:ascii="Symbol" w:hAnsi="Symbol" w:cs="Symbol" w:hint="default"/>
       </w:rPr>
     </w:lvl>
     <w:lvl w:ilvl="1">
@@ -3254,7 +3296,7 @@
         <w:ind w:left="1440" w:hanging="360"/>
       </w:pPr>
       <w:rPr>
-        <w:rFonts w:hint="default" w:ascii="Courier New" w:hAnsi="Courier New" w:cs="Courier New"/>
+        <w:rFonts w:ascii="Courier New" w:hAnsi="Courier New" w:cs="Courier New" w:hint="default"/>
       </w:rPr>
     </w:lvl>
     <w:lvl w:ilvl="2">
@@ -3269,7 +3311,7 @@
         <w:ind w:left="2160" w:hanging="360"/>
       </w:pPr>
       <w:rPr>
-        <w:rFonts w:hint="default" w:ascii="Wingdings" w:hAnsi="Wingdings" w:cs="Wingdings"/>
+        <w:rFonts w:ascii="Wingdings" w:hAnsi="Wingdings" w:cs="Wingdings" w:hint="default"/>
       </w:rPr>
     </w:lvl>
     <w:lvl w:ilvl="3">
@@ -3284,7 +3326,7 @@
         <w:ind w:left="2880" w:hanging="360"/>
       </w:pPr>
       <w:rPr>
-        <w:rFonts w:hint="default" w:ascii="Symbol" w:hAnsi="Symbol" w:cs="Symbol"/>
+        <w:rFonts w:ascii="Symbol" w:hAnsi="Symbol" w:cs="Symbol" w:hint="default"/>
       </w:rPr>
     </w:lvl>
     <w:lvl w:ilvl="4">
@@ -3299,7 +3341,7 @@
         <w:ind w:left="3600" w:hanging="360"/>
       </w:pPr>
       <w:rPr>
-        <w:rFonts w:hint="default" w:ascii="Courier New" w:hAnsi="Courier New" w:cs="Courier New"/>
+        <w:rFonts w:ascii="Courier New" w:hAnsi="Courier New" w:cs="Courier New" w:hint="default"/>
       </w:rPr>
     </w:lvl>
     <w:lvl w:ilvl="5">
@@ -3314,7 +3356,7 @@
         <w:ind w:left="4320" w:hanging="360"/>
       </w:pPr>
       <w:rPr>
-        <w:rFonts w:hint="default" w:ascii="Wingdings" w:hAnsi="Wingdings" w:cs="Wingdings"/>
+        <w:rFonts w:ascii="Wingdings" w:hAnsi="Wingdings" w:cs="Wingdings" w:hint="default"/>
       </w:rPr>
     </w:lvl>
     <w:lvl w:ilvl="6">
@@ -3329,7 +3371,7 @@
         <w:ind w:left="5040" w:hanging="360"/>
       </w:pPr>
       <w:rPr>
-        <w:rFonts w:hint="default" w:ascii="Symbol" w:hAnsi="Symbol" w:cs="Symbol"/>
+        <w:rFonts w:ascii="Symbol" w:hAnsi="Symbol" w:cs="Symbol" w:hint="default"/>
       </w:rPr>
     </w:lvl>
     <w:lvl w:ilvl="7">
@@ -3344,7 +3386,7 @@
         <w:ind w:left="5760" w:hanging="360"/>
       </w:pPr>
       <w:rPr>
-        <w:rFonts w:hint="default" w:ascii="Courier New" w:hAnsi="Courier New" w:cs="Courier New"/>
+        <w:rFonts w:ascii="Courier New" w:hAnsi="Courier New" w:cs="Courier New" w:hint="default"/>
       </w:rPr>
     </w:lvl>
     <w:lvl w:ilvl="8">
@@ -3359,10 +3401,9 @@
         <w:ind w:left="6480" w:hanging="360"/>
       </w:pPr>
       <w:rPr>
-        <w:rFonts w:hint="default" w:ascii="Wingdings" w:hAnsi="Wingdings" w:cs="Wingdings"/>
-      </w:rPr>
-    </w:lvl>
-    <w:nsid w:val="1d456a1f"/>
+        <w:rFonts w:ascii="Wingdings" w:hAnsi="Wingdings" w:cs="Wingdings" w:hint="default"/>
+      </w:rPr>
+    </w:lvl>
   </w:abstractNum>
   <w:abstractNum w:abstractNumId="7">
     <w:lvl w:ilvl="0">
@@ -3482,7 +3523,6 @@
         <w:ind w:left="0" w:hanging="0"/>
       </w:pPr>
     </w:lvl>
-    <w:nsid w:val="2ecb637c"/>
   </w:abstractNum>
   <w:num w:numId="1">
     <w:abstractNumId w:val="1"/>
@@ -3509,11 +3549,11 @@
 </file>
 
 <file path=word/styles.xml><?xml version="1.0" encoding="utf-8"?>
-<w:styles xmlns:wp14="http://schemas.microsoft.com/office/word/2010/wordprocessingDrawing" xmlns:w="http://schemas.openxmlformats.org/wordprocessingml/2006/main" xmlns:w14="http://schemas.microsoft.com/office/word/2010/wordml" xmlns:mc="http://schemas.openxmlformats.org/markup-compatibility/2006" mc:Ignorable="w14 wp14">
+<w:styles xmlns:w="http://schemas.openxmlformats.org/wordprocessingml/2006/main" xmlns:w14="http://schemas.microsoft.com/office/word/2010/wordml" xmlns:mc="http://schemas.openxmlformats.org/markup-compatibility/2006" mc:Ignorable="w14">
   <w:docDefaults>
     <w:rPrDefault>
       <w:rPr>
-        <w:rFonts w:ascii="Aptos" w:hAnsi="Aptos" w:eastAsia="" w:cs="" w:asciiTheme="minorHAnsi" w:hAnsiTheme="minorHAnsi" w:eastAsiaTheme="minorEastAsia" w:cstheme="minorBidi"/>
+        <w:rFonts w:ascii="Aptos" w:hAnsi="Aptos" w:eastAsia="" w:cs="" w:asciiTheme="minorHAnsi" w:cstheme="minorBidi" w:eastAsiaTheme="minorEastAsia" w:hAnsiTheme="minorHAnsi"/>
         <w:kern w:val="2"/>
         <w:sz w:val="24"/>
         <w:szCs w:val="24"/>
@@ -3913,8 +3953,8 @@
       <w:widowControl/>
       <w:suppressAutoHyphens w:val="true"/>
       <w:bidi w:val="0"/>
-      <w:spacing w:before="0" w:after="5" w:line="247" w:lineRule="auto"/>
-      <w:ind w:left="3250" w:right="2862" w:hanging="370"/>
+      <w:spacing w:lineRule="auto" w:line="247" w:before="0" w:after="5"/>
+      <w:ind w:hanging="370" w:left="3250" w:right="2862"/>
       <w:jc w:val="left"/>
     </w:pPr>
     <w:rPr>
@@ -3927,7 +3967,7 @@
     </w:rPr>
   </w:style>
   <w:style w:type="paragraph" w:styleId="Heading1">
-    <w:name w:val="heading 1"/>
+    <w:name w:val="Heading 1"/>
     <w:next w:val="Normal"/>
     <w:link w:val="Heading1Char"/>
     <w:uiPriority w:val="9"/>
@@ -3938,8 +3978,8 @@
       <w:widowControl/>
       <w:suppressAutoHyphens w:val="true"/>
       <w:bidi w:val="0"/>
-      <w:spacing w:before="0" w:after="96" w:line="259" w:lineRule="auto"/>
-      <w:ind w:left="10" w:hanging="10"/>
+      <w:spacing w:lineRule="auto" w:line="259" w:before="0" w:after="96"/>
+      <w:ind w:hanging="10" w:left="10"/>
       <w:jc w:val="left"/>
       <w:outlineLvl w:val="0"/>
     </w:pPr>
@@ -3954,7 +3994,7 @@
     </w:rPr>
   </w:style>
   <w:style w:type="paragraph" w:styleId="Heading3">
-    <w:name w:val="heading 3"/>
+    <w:name w:val="Heading 3"/>
     <w:basedOn w:val="Normal"/>
     <w:next w:val="Normal"/>
     <w:link w:val="Heading3Char"/>
@@ -3970,8 +4010,8 @@
       <w:outlineLvl w:val="2"/>
     </w:pPr>
     <w:rPr>
-      <w:rFonts w:ascii="Aptos Display" w:hAnsi="Aptos Display" w:eastAsia="" w:cs="" w:asciiTheme="majorHAnsi" w:hAnsiTheme="majorHAnsi" w:eastAsiaTheme="majorEastAsia" w:cstheme="majorBidi"/>
-      <w:color w:val="0A2F40" w:themeColor="accent1" w:themeShade="7f"/>
+      <w:rFonts w:ascii="Aptos Display" w:hAnsi="Aptos Display" w:eastAsia="" w:cs="" w:asciiTheme="majorHAnsi" w:cstheme="majorBidi" w:eastAsiaTheme="majorEastAsia" w:hAnsiTheme="majorHAnsi"/>
+      <w:color w:themeColor="accent1" w:themeShade="7f" w:val="0A2F40"/>
     </w:rPr>
   </w:style>
   <w:style w:type="character" w:styleId="DefaultParagraphFont" w:default="1">
@@ -4000,7 +4040,7 @@
     <w:unhideWhenUsed/>
     <w:rsid w:val="008c6aed"/>
     <w:rPr>
-      <w:color w:val="467886" w:themeColor="hyperlink"/>
+      <w:color w:themeColor="hyperlink" w:val="467886"/>
       <w:u w:val="single"/>
     </w:rPr>
   </w:style>
@@ -4014,7 +4054,7 @@
     <w:rsid w:val="008c6aed"/>
     <w:rPr>
       <w:color w:val="605E5C"/>
-      <w:shd w:val="clear" w:fill="E1DFDD"/>
+      <w:shd w:fill="E1DFDD" w:val="clear"/>
     </w:rPr>
   </w:style>
   <w:style w:type="character" w:styleId="Heading3Char" w:customStyle="1">
@@ -4026,8 +4066,8 @@
     <w:qFormat/>
     <w:rsid w:val="00316770"/>
     <w:rPr>
-      <w:rFonts w:ascii="Aptos Display" w:hAnsi="Aptos Display" w:eastAsia="" w:cs="" w:asciiTheme="majorHAnsi" w:hAnsiTheme="majorHAnsi" w:eastAsiaTheme="majorEastAsia" w:cstheme="majorBidi"/>
-      <w:color w:val="0A2F40" w:themeColor="accent1" w:themeShade="7f"/>
+      <w:rFonts w:ascii="Aptos Display" w:hAnsi="Aptos Display" w:eastAsia="" w:cs="" w:asciiTheme="majorHAnsi" w:cstheme="majorBidi" w:eastAsiaTheme="majorEastAsia" w:hAnsiTheme="majorHAnsi"/>
+      <w:color w:themeColor="accent1" w:themeShade="7f" w:val="0A2F40"/>
     </w:rPr>
   </w:style>
   <w:style w:type="paragraph" w:styleId="Heading">
@@ -4049,7 +4089,7 @@
     <w:name w:val="Body Text"/>
     <w:basedOn w:val="Normal"/>
     <w:pPr>
-      <w:spacing w:before="0" w:after="140" w:line="276" w:lineRule="auto"/>
+      <w:spacing w:lineRule="auto" w:line="276" w:before="0" w:after="140"/>
     </w:pPr>
     <w:rPr/>
   </w:style>
@@ -4108,7 +4148,7 @@
     <w:unhideWhenUsed/>
     <w:qFormat/>
   </w:style>
-  <w:style w:type="table" w:styleId="TableNormal" w:default="1">
+  <w:style w:type="table" w:default="1" w:styleId="TableNormal">
     <w:name w:val="Normal Table"/>
     <w:uiPriority w:val="99"/>
     <w:semiHidden/>

</xml_diff>